<commit_message>
Wizard refactor for edit mode
</commit_message>
<xml_diff>
--- a/dokumentFedotova.docx
+++ b/dokumentFedotova.docx
@@ -380,8 +380,9 @@
             <w:pStyle w:val="TOC1"/>
             <w:rPr>
               <w:rFonts w:asciiTheme="minorHAnsi" w:eastAsiaTheme="minorEastAsia" w:hAnsiTheme="minorHAnsi"/>
+              <w:noProof/>
               <w:color w:val="auto"/>
-              <w:lang w:eastAsia="ru-RU"/>
+              <w:lang w:val="ru-RU" w:eastAsia="ru-RU"/>
             </w:rPr>
           </w:pPr>
           <w:r>
@@ -393,50 +394,58 @@
           <w:r>
             <w:fldChar w:fldCharType="separate"/>
           </w:r>
-          <w:hyperlink w:anchor="_Toc213439980" w:history="1">
+          <w:hyperlink w:anchor="_Toc229746165" w:history="1">
             <w:r>
               <w:rPr>
                 <w:rStyle w:val="Hyperlink"/>
+                <w:noProof/>
               </w:rPr>
               <w:t>Ievads</w:t>
             </w:r>
             <w:r>
               <w:rPr>
+                <w:noProof/>
                 <w:webHidden/>
               </w:rPr>
               <w:tab/>
             </w:r>
             <w:r>
               <w:rPr>
+                <w:noProof/>
                 <w:webHidden/>
               </w:rPr>
               <w:fldChar w:fldCharType="begin"/>
             </w:r>
             <w:r>
               <w:rPr>
+                <w:noProof/>
                 <w:webHidden/>
               </w:rPr>
-              <w:instrText xml:space="preserve"> PAGEREF _Toc213439980 \h </w:instrText>
-            </w:r>
-            <w:r>
-              <w:rPr>
+              <w:instrText xml:space="preserve"> PAGEREF _Toc229746165 \h </w:instrText>
+            </w:r>
+            <w:r>
+              <w:rPr>
+                <w:noProof/>
                 <w:webHidden/>
               </w:rPr>
             </w:r>
             <w:r>
               <w:rPr>
+                <w:noProof/>
                 <w:webHidden/>
               </w:rPr>
               <w:fldChar w:fldCharType="separate"/>
             </w:r>
             <w:r>
               <w:rPr>
+                <w:noProof/>
                 <w:webHidden/>
               </w:rPr>
               <w:t>4</w:t>
             </w:r>
             <w:r>
               <w:rPr>
+                <w:noProof/>
                 <w:webHidden/>
               </w:rPr>
               <w:fldChar w:fldCharType="end"/>
@@ -448,54 +457,63 @@
             <w:pStyle w:val="TOC1"/>
             <w:rPr>
               <w:rFonts w:asciiTheme="minorHAnsi" w:eastAsiaTheme="minorEastAsia" w:hAnsiTheme="minorHAnsi"/>
+              <w:noProof/>
               <w:color w:val="auto"/>
-              <w:lang w:eastAsia="ru-RU"/>
+              <w:lang w:val="ru-RU" w:eastAsia="ru-RU"/>
             </w:rPr>
           </w:pPr>
-          <w:hyperlink w:anchor="_Toc213439981" w:history="1">
+          <w:hyperlink w:anchor="_Toc229746166" w:history="1">
             <w:r>
               <w:rPr>
                 <w:rStyle w:val="Hyperlink"/>
+                <w:noProof/>
               </w:rPr>
               <w:t>1. Uzdevuma formulējums</w:t>
             </w:r>
             <w:r>
               <w:rPr>
+                <w:noProof/>
                 <w:webHidden/>
               </w:rPr>
               <w:tab/>
             </w:r>
             <w:r>
               <w:rPr>
+                <w:noProof/>
                 <w:webHidden/>
               </w:rPr>
               <w:fldChar w:fldCharType="begin"/>
             </w:r>
             <w:r>
               <w:rPr>
+                <w:noProof/>
                 <w:webHidden/>
               </w:rPr>
-              <w:instrText xml:space="preserve"> PAGEREF _Toc213439981 \h </w:instrText>
-            </w:r>
-            <w:r>
-              <w:rPr>
+              <w:instrText xml:space="preserve"> PAGEREF _Toc229746166 \h </w:instrText>
+            </w:r>
+            <w:r>
+              <w:rPr>
+                <w:noProof/>
                 <w:webHidden/>
               </w:rPr>
             </w:r>
             <w:r>
               <w:rPr>
+                <w:noProof/>
                 <w:webHidden/>
               </w:rPr>
               <w:fldChar w:fldCharType="separate"/>
             </w:r>
             <w:r>
               <w:rPr>
+                <w:noProof/>
                 <w:webHidden/>
               </w:rPr>
               <w:t>5</w:t>
             </w:r>
             <w:r>
               <w:rPr>
+                <w:noProof/>
                 <w:webHidden/>
               </w:rPr>
               <w:fldChar w:fldCharType="end"/>
@@ -507,54 +525,63 @@
             <w:pStyle w:val="TOC1"/>
             <w:rPr>
               <w:rFonts w:asciiTheme="minorHAnsi" w:eastAsiaTheme="minorEastAsia" w:hAnsiTheme="minorHAnsi"/>
+              <w:noProof/>
               <w:color w:val="auto"/>
-              <w:lang w:eastAsia="ru-RU"/>
+              <w:lang w:val="ru-RU" w:eastAsia="ru-RU"/>
             </w:rPr>
           </w:pPr>
-          <w:hyperlink w:anchor="_Toc213439982" w:history="1">
+          <w:hyperlink w:anchor="_Toc229746167" w:history="1">
             <w:r>
               <w:rPr>
                 <w:rStyle w:val="Hyperlink"/>
+                <w:noProof/>
               </w:rPr>
               <w:t>2. Programmatūras prasību specifikācija</w:t>
             </w:r>
             <w:r>
               <w:rPr>
+                <w:noProof/>
                 <w:webHidden/>
               </w:rPr>
               <w:tab/>
             </w:r>
             <w:r>
               <w:rPr>
+                <w:noProof/>
                 <w:webHidden/>
               </w:rPr>
               <w:fldChar w:fldCharType="begin"/>
             </w:r>
             <w:r>
               <w:rPr>
+                <w:noProof/>
                 <w:webHidden/>
               </w:rPr>
-              <w:instrText xml:space="preserve"> PAGEREF _Toc213439982 \h </w:instrText>
-            </w:r>
-            <w:r>
-              <w:rPr>
+              <w:instrText xml:space="preserve"> PAGEREF _Toc229746167 \h </w:instrText>
+            </w:r>
+            <w:r>
+              <w:rPr>
+                <w:noProof/>
                 <w:webHidden/>
               </w:rPr>
             </w:r>
             <w:r>
               <w:rPr>
+                <w:noProof/>
                 <w:webHidden/>
               </w:rPr>
               <w:fldChar w:fldCharType="separate"/>
             </w:r>
             <w:r>
               <w:rPr>
+                <w:noProof/>
                 <w:webHidden/>
               </w:rPr>
               <w:t>6</w:t>
             </w:r>
             <w:r>
               <w:rPr>
+                <w:noProof/>
                 <w:webHidden/>
               </w:rPr>
               <w:fldChar w:fldCharType="end"/>
@@ -566,54 +593,63 @@
             <w:pStyle w:val="TOC2"/>
             <w:rPr>
               <w:rFonts w:asciiTheme="minorHAnsi" w:eastAsiaTheme="minorEastAsia" w:hAnsiTheme="minorHAnsi"/>
+              <w:noProof/>
               <w:color w:val="auto"/>
-              <w:lang w:eastAsia="ru-RU"/>
+              <w:lang w:val="ru-RU" w:eastAsia="ru-RU"/>
             </w:rPr>
           </w:pPr>
-          <w:hyperlink w:anchor="_Toc213439983" w:history="1">
+          <w:hyperlink w:anchor="_Toc229746168" w:history="1">
             <w:r>
               <w:rPr>
                 <w:rStyle w:val="Hyperlink"/>
+                <w:noProof/>
               </w:rPr>
               <w:t>2.1. Produkta perspektīva</w:t>
             </w:r>
             <w:r>
               <w:rPr>
+                <w:noProof/>
                 <w:webHidden/>
               </w:rPr>
               <w:tab/>
             </w:r>
             <w:r>
               <w:rPr>
+                <w:noProof/>
                 <w:webHidden/>
               </w:rPr>
               <w:fldChar w:fldCharType="begin"/>
             </w:r>
             <w:r>
               <w:rPr>
+                <w:noProof/>
                 <w:webHidden/>
               </w:rPr>
-              <w:instrText xml:space="preserve"> PAGEREF _Toc213439983 \h </w:instrText>
-            </w:r>
-            <w:r>
-              <w:rPr>
+              <w:instrText xml:space="preserve"> PAGEREF _Toc229746168 \h </w:instrText>
+            </w:r>
+            <w:r>
+              <w:rPr>
+                <w:noProof/>
                 <w:webHidden/>
               </w:rPr>
             </w:r>
             <w:r>
               <w:rPr>
+                <w:noProof/>
                 <w:webHidden/>
               </w:rPr>
               <w:fldChar w:fldCharType="separate"/>
             </w:r>
             <w:r>
               <w:rPr>
+                <w:noProof/>
                 <w:webHidden/>
               </w:rPr>
               <w:t>6</w:t>
             </w:r>
             <w:r>
               <w:rPr>
+                <w:noProof/>
                 <w:webHidden/>
               </w:rPr>
               <w:fldChar w:fldCharType="end"/>
@@ -625,54 +661,63 @@
             <w:pStyle w:val="TOC2"/>
             <w:rPr>
               <w:rFonts w:asciiTheme="minorHAnsi" w:eastAsiaTheme="minorEastAsia" w:hAnsiTheme="minorHAnsi"/>
+              <w:noProof/>
               <w:color w:val="auto"/>
-              <w:lang w:eastAsia="ru-RU"/>
+              <w:lang w:val="ru-RU" w:eastAsia="ru-RU"/>
             </w:rPr>
           </w:pPr>
-          <w:hyperlink w:anchor="_Toc213439984" w:history="1">
+          <w:hyperlink w:anchor="_Toc229746169" w:history="1">
             <w:r>
               <w:rPr>
                 <w:rStyle w:val="Hyperlink"/>
+                <w:noProof/>
               </w:rPr>
               <w:t>2.2. Sistēmas funkcionālās prasības</w:t>
             </w:r>
             <w:r>
               <w:rPr>
+                <w:noProof/>
                 <w:webHidden/>
               </w:rPr>
               <w:tab/>
             </w:r>
             <w:r>
               <w:rPr>
+                <w:noProof/>
                 <w:webHidden/>
               </w:rPr>
               <w:fldChar w:fldCharType="begin"/>
             </w:r>
             <w:r>
               <w:rPr>
+                <w:noProof/>
                 <w:webHidden/>
               </w:rPr>
-              <w:instrText xml:space="preserve"> PAGEREF _Toc213439984 \h </w:instrText>
-            </w:r>
-            <w:r>
-              <w:rPr>
+              <w:instrText xml:space="preserve"> PAGEREF _Toc229746169 \h </w:instrText>
+            </w:r>
+            <w:r>
+              <w:rPr>
+                <w:noProof/>
                 <w:webHidden/>
               </w:rPr>
             </w:r>
             <w:r>
               <w:rPr>
+                <w:noProof/>
                 <w:webHidden/>
               </w:rPr>
               <w:fldChar w:fldCharType="separate"/>
             </w:r>
             <w:r>
               <w:rPr>
+                <w:noProof/>
                 <w:webHidden/>
               </w:rPr>
               <w:t>6</w:t>
             </w:r>
             <w:r>
               <w:rPr>
+                <w:noProof/>
                 <w:webHidden/>
               </w:rPr>
               <w:fldChar w:fldCharType="end"/>
@@ -687,54 +732,63 @@
             </w:tabs>
             <w:rPr>
               <w:rFonts w:asciiTheme="minorHAnsi" w:eastAsiaTheme="minorEastAsia" w:hAnsiTheme="minorHAnsi"/>
+              <w:noProof/>
               <w:color w:val="auto"/>
-              <w:lang w:eastAsia="ru-RU"/>
+              <w:lang w:val="ru-RU" w:eastAsia="ru-RU"/>
             </w:rPr>
           </w:pPr>
-          <w:hyperlink w:anchor="_Toc213439985" w:history="1">
+          <w:hyperlink w:anchor="_Toc229746170" w:history="1">
             <w:r>
               <w:rPr>
                 <w:rStyle w:val="Hyperlink"/>
+                <w:noProof/>
               </w:rPr>
               <w:t>2.2.1. Neautorizētiem lietotājiem</w:t>
             </w:r>
             <w:r>
               <w:rPr>
+                <w:noProof/>
                 <w:webHidden/>
               </w:rPr>
               <w:tab/>
             </w:r>
             <w:r>
               <w:rPr>
+                <w:noProof/>
                 <w:webHidden/>
               </w:rPr>
               <w:fldChar w:fldCharType="begin"/>
             </w:r>
             <w:r>
               <w:rPr>
+                <w:noProof/>
                 <w:webHidden/>
               </w:rPr>
-              <w:instrText xml:space="preserve"> PAGEREF _Toc213439985 \h </w:instrText>
-            </w:r>
-            <w:r>
-              <w:rPr>
+              <w:instrText xml:space="preserve"> PAGEREF _Toc229746170 \h </w:instrText>
+            </w:r>
+            <w:r>
+              <w:rPr>
+                <w:noProof/>
                 <w:webHidden/>
               </w:rPr>
             </w:r>
             <w:r>
               <w:rPr>
+                <w:noProof/>
                 <w:webHidden/>
               </w:rPr>
               <w:fldChar w:fldCharType="separate"/>
             </w:r>
             <w:r>
               <w:rPr>
+                <w:noProof/>
                 <w:webHidden/>
               </w:rPr>
               <w:t>6</w:t>
             </w:r>
             <w:r>
               <w:rPr>
+                <w:noProof/>
                 <w:webHidden/>
               </w:rPr>
               <w:fldChar w:fldCharType="end"/>
@@ -749,54 +803,63 @@
             </w:tabs>
             <w:rPr>
               <w:rFonts w:asciiTheme="minorHAnsi" w:eastAsiaTheme="minorEastAsia" w:hAnsiTheme="minorHAnsi"/>
+              <w:noProof/>
               <w:color w:val="auto"/>
-              <w:lang w:eastAsia="ru-RU"/>
+              <w:lang w:val="ru-RU" w:eastAsia="ru-RU"/>
             </w:rPr>
           </w:pPr>
-          <w:hyperlink w:anchor="_Toc213439986" w:history="1">
+          <w:hyperlink w:anchor="_Toc229746171" w:history="1">
             <w:r>
               <w:rPr>
                 <w:rStyle w:val="Hyperlink"/>
+                <w:noProof/>
               </w:rPr>
               <w:t>2.2.2. Autorizētiem lietotājiem</w:t>
             </w:r>
             <w:r>
               <w:rPr>
+                <w:noProof/>
                 <w:webHidden/>
               </w:rPr>
               <w:tab/>
             </w:r>
             <w:r>
               <w:rPr>
+                <w:noProof/>
                 <w:webHidden/>
               </w:rPr>
               <w:fldChar w:fldCharType="begin"/>
             </w:r>
             <w:r>
               <w:rPr>
+                <w:noProof/>
                 <w:webHidden/>
               </w:rPr>
-              <w:instrText xml:space="preserve"> PAGEREF _Toc213439986 \h </w:instrText>
-            </w:r>
-            <w:r>
-              <w:rPr>
+              <w:instrText xml:space="preserve"> PAGEREF _Toc229746171 \h </w:instrText>
+            </w:r>
+            <w:r>
+              <w:rPr>
+                <w:noProof/>
                 <w:webHidden/>
               </w:rPr>
             </w:r>
             <w:r>
               <w:rPr>
+                <w:noProof/>
                 <w:webHidden/>
               </w:rPr>
               <w:fldChar w:fldCharType="separate"/>
             </w:r>
             <w:r>
               <w:rPr>
+                <w:noProof/>
                 <w:webHidden/>
               </w:rPr>
-              <w:t>7</w:t>
-            </w:r>
-            <w:r>
-              <w:rPr>
+              <w:t>9</w:t>
+            </w:r>
+            <w:r>
+              <w:rPr>
+                <w:noProof/>
                 <w:webHidden/>
               </w:rPr>
               <w:fldChar w:fldCharType="end"/>
@@ -811,54 +874,63 @@
             </w:tabs>
             <w:rPr>
               <w:rFonts w:asciiTheme="minorHAnsi" w:eastAsiaTheme="minorEastAsia" w:hAnsiTheme="minorHAnsi"/>
+              <w:noProof/>
               <w:color w:val="auto"/>
-              <w:lang w:eastAsia="ru-RU"/>
+              <w:lang w:val="ru-RU" w:eastAsia="ru-RU"/>
             </w:rPr>
           </w:pPr>
-          <w:hyperlink w:anchor="_Toc213439987" w:history="1">
+          <w:hyperlink w:anchor="_Toc229746172" w:history="1">
             <w:r>
               <w:rPr>
                 <w:rStyle w:val="Hyperlink"/>
-              </w:rPr>
-              <w:t>2.2.3. Moderatoram</w:t>
-            </w:r>
-            <w:r>
-              <w:rPr>
+                <w:noProof/>
+              </w:rPr>
+              <w:t>2.2.3. Moderatoriem</w:t>
+            </w:r>
+            <w:r>
+              <w:rPr>
+                <w:noProof/>
                 <w:webHidden/>
               </w:rPr>
               <w:tab/>
             </w:r>
             <w:r>
               <w:rPr>
+                <w:noProof/>
                 <w:webHidden/>
               </w:rPr>
               <w:fldChar w:fldCharType="begin"/>
             </w:r>
             <w:r>
               <w:rPr>
+                <w:noProof/>
                 <w:webHidden/>
               </w:rPr>
-              <w:instrText xml:space="preserve"> PAGEREF _Toc213439987 \h </w:instrText>
-            </w:r>
-            <w:r>
-              <w:rPr>
+              <w:instrText xml:space="preserve"> PAGEREF _Toc229746172 \h </w:instrText>
+            </w:r>
+            <w:r>
+              <w:rPr>
+                <w:noProof/>
                 <w:webHidden/>
               </w:rPr>
             </w:r>
             <w:r>
               <w:rPr>
+                <w:noProof/>
                 <w:webHidden/>
               </w:rPr>
               <w:fldChar w:fldCharType="separate"/>
             </w:r>
             <w:r>
               <w:rPr>
+                <w:noProof/>
                 <w:webHidden/>
               </w:rPr>
-              <w:t>11</w:t>
-            </w:r>
-            <w:r>
-              <w:rPr>
+              <w:t>13</w:t>
+            </w:r>
+            <w:r>
+              <w:rPr>
+                <w:noProof/>
                 <w:webHidden/>
               </w:rPr>
               <w:fldChar w:fldCharType="end"/>
@@ -873,54 +945,63 @@
             </w:tabs>
             <w:rPr>
               <w:rFonts w:asciiTheme="minorHAnsi" w:eastAsiaTheme="minorEastAsia" w:hAnsiTheme="minorHAnsi"/>
+              <w:noProof/>
               <w:color w:val="auto"/>
-              <w:lang w:eastAsia="ru-RU"/>
+              <w:lang w:val="ru-RU" w:eastAsia="ru-RU"/>
             </w:rPr>
           </w:pPr>
-          <w:hyperlink w:anchor="_Toc213439988" w:history="1">
+          <w:hyperlink w:anchor="_Toc229746173" w:history="1">
             <w:r>
               <w:rPr>
                 <w:rStyle w:val="Hyperlink"/>
-              </w:rPr>
-              <w:t>2.2.4. Administratoram (PAPILDINAT)</w:t>
-            </w:r>
-            <w:r>
-              <w:rPr>
+                <w:noProof/>
+              </w:rPr>
+              <w:t>2.2.4. Administratoriem</w:t>
+            </w:r>
+            <w:r>
+              <w:rPr>
+                <w:noProof/>
                 <w:webHidden/>
               </w:rPr>
               <w:tab/>
             </w:r>
             <w:r>
               <w:rPr>
+                <w:noProof/>
                 <w:webHidden/>
               </w:rPr>
               <w:fldChar w:fldCharType="begin"/>
             </w:r>
             <w:r>
               <w:rPr>
+                <w:noProof/>
                 <w:webHidden/>
               </w:rPr>
-              <w:instrText xml:space="preserve"> PAGEREF _Toc213439988 \h </w:instrText>
-            </w:r>
-            <w:r>
-              <w:rPr>
+              <w:instrText xml:space="preserve"> PAGEREF _Toc229746173 \h </w:instrText>
+            </w:r>
+            <w:r>
+              <w:rPr>
+                <w:noProof/>
                 <w:webHidden/>
               </w:rPr>
             </w:r>
             <w:r>
               <w:rPr>
+                <w:noProof/>
                 <w:webHidden/>
               </w:rPr>
               <w:fldChar w:fldCharType="separate"/>
             </w:r>
             <w:r>
               <w:rPr>
+                <w:noProof/>
                 <w:webHidden/>
               </w:rPr>
-              <w:t>12</w:t>
-            </w:r>
-            <w:r>
-              <w:rPr>
+              <w:t>15</w:t>
+            </w:r>
+            <w:r>
+              <w:rPr>
+                <w:noProof/>
                 <w:webHidden/>
               </w:rPr>
               <w:fldChar w:fldCharType="end"/>
@@ -932,54 +1013,63 @@
             <w:pStyle w:val="TOC2"/>
             <w:rPr>
               <w:rFonts w:asciiTheme="minorHAnsi" w:eastAsiaTheme="minorEastAsia" w:hAnsiTheme="minorHAnsi"/>
+              <w:noProof/>
               <w:color w:val="auto"/>
-              <w:lang w:eastAsia="ru-RU"/>
+              <w:lang w:val="ru-RU" w:eastAsia="ru-RU"/>
             </w:rPr>
           </w:pPr>
-          <w:hyperlink w:anchor="_Toc213439989" w:history="1">
+          <w:hyperlink w:anchor="_Toc229746174" w:history="1">
             <w:r>
               <w:rPr>
                 <w:rStyle w:val="Hyperlink"/>
+                <w:noProof/>
               </w:rPr>
               <w:t>2.3. Sistēmas nefunkcionālās prasības</w:t>
             </w:r>
             <w:r>
               <w:rPr>
+                <w:noProof/>
                 <w:webHidden/>
               </w:rPr>
               <w:tab/>
             </w:r>
             <w:r>
               <w:rPr>
+                <w:noProof/>
                 <w:webHidden/>
               </w:rPr>
               <w:fldChar w:fldCharType="begin"/>
             </w:r>
             <w:r>
               <w:rPr>
+                <w:noProof/>
                 <w:webHidden/>
               </w:rPr>
-              <w:instrText xml:space="preserve"> PAGEREF _Toc213439989 \h </w:instrText>
-            </w:r>
-            <w:r>
-              <w:rPr>
+              <w:instrText xml:space="preserve"> PAGEREF _Toc229746174 \h </w:instrText>
+            </w:r>
+            <w:r>
+              <w:rPr>
+                <w:noProof/>
                 <w:webHidden/>
               </w:rPr>
             </w:r>
             <w:r>
               <w:rPr>
+                <w:noProof/>
                 <w:webHidden/>
               </w:rPr>
               <w:fldChar w:fldCharType="separate"/>
             </w:r>
             <w:r>
               <w:rPr>
+                <w:noProof/>
                 <w:webHidden/>
               </w:rPr>
-              <w:t>13</w:t>
-            </w:r>
-            <w:r>
-              <w:rPr>
+              <w:t>17</w:t>
+            </w:r>
+            <w:r>
+              <w:rPr>
+                <w:noProof/>
                 <w:webHidden/>
               </w:rPr>
               <w:fldChar w:fldCharType="end"/>
@@ -994,54 +1084,63 @@
             </w:tabs>
             <w:rPr>
               <w:rFonts w:asciiTheme="minorHAnsi" w:eastAsiaTheme="minorEastAsia" w:hAnsiTheme="minorHAnsi"/>
+              <w:noProof/>
               <w:color w:val="auto"/>
-              <w:lang w:eastAsia="ru-RU"/>
+              <w:lang w:val="ru-RU" w:eastAsia="ru-RU"/>
             </w:rPr>
           </w:pPr>
-          <w:hyperlink w:anchor="_Toc213439990" w:history="1">
+          <w:hyperlink w:anchor="_Toc229746175" w:history="1">
             <w:r>
               <w:rPr>
                 <w:rStyle w:val="Hyperlink"/>
+                <w:noProof/>
               </w:rPr>
               <w:t>2.3.1. Veiktspējas prasības</w:t>
             </w:r>
             <w:r>
               <w:rPr>
+                <w:noProof/>
                 <w:webHidden/>
               </w:rPr>
               <w:tab/>
             </w:r>
             <w:r>
               <w:rPr>
+                <w:noProof/>
                 <w:webHidden/>
               </w:rPr>
               <w:fldChar w:fldCharType="begin"/>
             </w:r>
             <w:r>
               <w:rPr>
+                <w:noProof/>
                 <w:webHidden/>
               </w:rPr>
-              <w:instrText xml:space="preserve"> PAGEREF _Toc213439990 \h </w:instrText>
-            </w:r>
-            <w:r>
-              <w:rPr>
+              <w:instrText xml:space="preserve"> PAGEREF _Toc229746175 \h </w:instrText>
+            </w:r>
+            <w:r>
+              <w:rPr>
+                <w:noProof/>
                 <w:webHidden/>
               </w:rPr>
             </w:r>
             <w:r>
               <w:rPr>
+                <w:noProof/>
                 <w:webHidden/>
               </w:rPr>
               <w:fldChar w:fldCharType="separate"/>
             </w:r>
             <w:r>
               <w:rPr>
+                <w:noProof/>
                 <w:webHidden/>
               </w:rPr>
-              <w:t>13</w:t>
-            </w:r>
-            <w:r>
-              <w:rPr>
+              <w:t>17</w:t>
+            </w:r>
+            <w:r>
+              <w:rPr>
+                <w:noProof/>
                 <w:webHidden/>
               </w:rPr>
               <w:fldChar w:fldCharType="end"/>
@@ -1056,54 +1155,63 @@
             </w:tabs>
             <w:rPr>
               <w:rFonts w:asciiTheme="minorHAnsi" w:eastAsiaTheme="minorEastAsia" w:hAnsiTheme="minorHAnsi"/>
+              <w:noProof/>
               <w:color w:val="auto"/>
-              <w:lang w:eastAsia="ru-RU"/>
+              <w:lang w:val="ru-RU" w:eastAsia="ru-RU"/>
             </w:rPr>
           </w:pPr>
-          <w:hyperlink w:anchor="_Toc213439991" w:history="1">
+          <w:hyperlink w:anchor="_Toc229746176" w:history="1">
             <w:r>
               <w:rPr>
                 <w:rStyle w:val="Hyperlink"/>
+                <w:noProof/>
               </w:rPr>
               <w:t>2.3.2. Projekta tehniskie ierobežojumi</w:t>
             </w:r>
             <w:r>
               <w:rPr>
+                <w:noProof/>
                 <w:webHidden/>
               </w:rPr>
               <w:tab/>
             </w:r>
             <w:r>
               <w:rPr>
+                <w:noProof/>
                 <w:webHidden/>
               </w:rPr>
               <w:fldChar w:fldCharType="begin"/>
             </w:r>
             <w:r>
               <w:rPr>
+                <w:noProof/>
                 <w:webHidden/>
               </w:rPr>
-              <w:instrText xml:space="preserve"> PAGEREF _Toc213439991 \h </w:instrText>
-            </w:r>
-            <w:r>
-              <w:rPr>
+              <w:instrText xml:space="preserve"> PAGEREF _Toc229746176 \h </w:instrText>
+            </w:r>
+            <w:r>
+              <w:rPr>
+                <w:noProof/>
                 <w:webHidden/>
               </w:rPr>
             </w:r>
             <w:r>
               <w:rPr>
+                <w:noProof/>
                 <w:webHidden/>
               </w:rPr>
               <w:fldChar w:fldCharType="separate"/>
             </w:r>
             <w:r>
               <w:rPr>
+                <w:noProof/>
                 <w:webHidden/>
               </w:rPr>
-              <w:t>13</w:t>
-            </w:r>
-            <w:r>
-              <w:rPr>
+              <w:t>17</w:t>
+            </w:r>
+            <w:r>
+              <w:rPr>
+                <w:noProof/>
                 <w:webHidden/>
               </w:rPr>
               <w:fldChar w:fldCharType="end"/>
@@ -1118,54 +1226,63 @@
             </w:tabs>
             <w:rPr>
               <w:rFonts w:asciiTheme="minorHAnsi" w:eastAsiaTheme="minorEastAsia" w:hAnsiTheme="minorHAnsi"/>
+              <w:noProof/>
               <w:color w:val="auto"/>
-              <w:lang w:eastAsia="ru-RU"/>
+              <w:lang w:val="ru-RU" w:eastAsia="ru-RU"/>
             </w:rPr>
           </w:pPr>
-          <w:hyperlink w:anchor="_Toc213439992" w:history="1">
+          <w:hyperlink w:anchor="_Toc229746177" w:history="1">
             <w:r>
               <w:rPr>
                 <w:rStyle w:val="Hyperlink"/>
+                <w:noProof/>
               </w:rPr>
               <w:t>2.3.3. Lietotāja saskarnes prasības</w:t>
             </w:r>
             <w:r>
               <w:rPr>
+                <w:noProof/>
                 <w:webHidden/>
               </w:rPr>
               <w:tab/>
             </w:r>
             <w:r>
               <w:rPr>
+                <w:noProof/>
                 <w:webHidden/>
               </w:rPr>
               <w:fldChar w:fldCharType="begin"/>
             </w:r>
             <w:r>
               <w:rPr>
+                <w:noProof/>
                 <w:webHidden/>
               </w:rPr>
-              <w:instrText xml:space="preserve"> PAGEREF _Toc213439992 \h </w:instrText>
-            </w:r>
-            <w:r>
-              <w:rPr>
+              <w:instrText xml:space="preserve"> PAGEREF _Toc229746177 \h </w:instrText>
+            </w:r>
+            <w:r>
+              <w:rPr>
+                <w:noProof/>
                 <w:webHidden/>
               </w:rPr>
             </w:r>
             <w:r>
               <w:rPr>
+                <w:noProof/>
                 <w:webHidden/>
               </w:rPr>
               <w:fldChar w:fldCharType="separate"/>
             </w:r>
             <w:r>
               <w:rPr>
+                <w:noProof/>
                 <w:webHidden/>
               </w:rPr>
-              <w:t>13</w:t>
-            </w:r>
-            <w:r>
-              <w:rPr>
+              <w:t>17</w:t>
+            </w:r>
+            <w:r>
+              <w:rPr>
+                <w:noProof/>
                 <w:webHidden/>
               </w:rPr>
               <w:fldChar w:fldCharType="end"/>
@@ -1180,54 +1297,63 @@
             </w:tabs>
             <w:rPr>
               <w:rFonts w:asciiTheme="minorHAnsi" w:eastAsiaTheme="minorEastAsia" w:hAnsiTheme="minorHAnsi"/>
+              <w:noProof/>
               <w:color w:val="auto"/>
-              <w:lang w:eastAsia="ru-RU"/>
+              <w:lang w:val="ru-RU" w:eastAsia="ru-RU"/>
             </w:rPr>
           </w:pPr>
-          <w:hyperlink w:anchor="_Toc213439993" w:history="1">
+          <w:hyperlink w:anchor="_Toc229746178" w:history="1">
             <w:r>
               <w:rPr>
                 <w:rStyle w:val="Hyperlink"/>
+                <w:noProof/>
               </w:rPr>
               <w:t>2.3.4. Drošības un kvalitātes prasības</w:t>
             </w:r>
             <w:r>
               <w:rPr>
+                <w:noProof/>
                 <w:webHidden/>
               </w:rPr>
               <w:tab/>
             </w:r>
             <w:r>
               <w:rPr>
+                <w:noProof/>
                 <w:webHidden/>
               </w:rPr>
               <w:fldChar w:fldCharType="begin"/>
             </w:r>
             <w:r>
               <w:rPr>
+                <w:noProof/>
                 <w:webHidden/>
               </w:rPr>
-              <w:instrText xml:space="preserve"> PAGEREF _Toc213439993 \h </w:instrText>
-            </w:r>
-            <w:r>
-              <w:rPr>
+              <w:instrText xml:space="preserve"> PAGEREF _Toc229746178 \h </w:instrText>
+            </w:r>
+            <w:r>
+              <w:rPr>
+                <w:noProof/>
                 <w:webHidden/>
               </w:rPr>
             </w:r>
             <w:r>
               <w:rPr>
+                <w:noProof/>
                 <w:webHidden/>
               </w:rPr>
               <w:fldChar w:fldCharType="separate"/>
             </w:r>
             <w:r>
               <w:rPr>
+                <w:noProof/>
                 <w:webHidden/>
               </w:rPr>
-              <w:t>13</w:t>
-            </w:r>
-            <w:r>
-              <w:rPr>
+              <w:t>18</w:t>
+            </w:r>
+            <w:r>
+              <w:rPr>
+                <w:noProof/>
                 <w:webHidden/>
               </w:rPr>
               <w:fldChar w:fldCharType="end"/>
@@ -1239,54 +1365,63 @@
             <w:pStyle w:val="TOC2"/>
             <w:rPr>
               <w:rFonts w:asciiTheme="minorHAnsi" w:eastAsiaTheme="minorEastAsia" w:hAnsiTheme="minorHAnsi"/>
+              <w:noProof/>
               <w:color w:val="auto"/>
-              <w:lang w:eastAsia="ru-RU"/>
+              <w:lang w:val="ru-RU" w:eastAsia="ru-RU"/>
             </w:rPr>
           </w:pPr>
-          <w:hyperlink w:anchor="_Toc213439994" w:history="1">
+          <w:hyperlink w:anchor="_Toc229746179" w:history="1">
             <w:r>
               <w:rPr>
                 <w:rStyle w:val="Hyperlink"/>
+                <w:noProof/>
               </w:rPr>
               <w:t>2.4. Gala lietotāja raksturiezīmes</w:t>
             </w:r>
             <w:r>
               <w:rPr>
+                <w:noProof/>
                 <w:webHidden/>
               </w:rPr>
               <w:tab/>
             </w:r>
             <w:r>
               <w:rPr>
+                <w:noProof/>
                 <w:webHidden/>
               </w:rPr>
               <w:fldChar w:fldCharType="begin"/>
             </w:r>
             <w:r>
               <w:rPr>
+                <w:noProof/>
                 <w:webHidden/>
               </w:rPr>
-              <w:instrText xml:space="preserve"> PAGEREF _Toc213439994 \h </w:instrText>
-            </w:r>
-            <w:r>
-              <w:rPr>
+              <w:instrText xml:space="preserve"> PAGEREF _Toc229746179 \h </w:instrText>
+            </w:r>
+            <w:r>
+              <w:rPr>
+                <w:noProof/>
                 <w:webHidden/>
               </w:rPr>
             </w:r>
             <w:r>
               <w:rPr>
+                <w:noProof/>
                 <w:webHidden/>
               </w:rPr>
               <w:fldChar w:fldCharType="separate"/>
             </w:r>
             <w:r>
               <w:rPr>
+                <w:noProof/>
                 <w:webHidden/>
               </w:rPr>
-              <w:t>13</w:t>
-            </w:r>
-            <w:r>
-              <w:rPr>
+              <w:t>18</w:t>
+            </w:r>
+            <w:r>
+              <w:rPr>
+                <w:noProof/>
                 <w:webHidden/>
               </w:rPr>
               <w:fldChar w:fldCharType="end"/>
@@ -1298,54 +1433,63 @@
             <w:pStyle w:val="TOC1"/>
             <w:rPr>
               <w:rFonts w:asciiTheme="minorHAnsi" w:eastAsiaTheme="minorEastAsia" w:hAnsiTheme="minorHAnsi"/>
+              <w:noProof/>
               <w:color w:val="auto"/>
-              <w:lang w:eastAsia="ru-RU"/>
+              <w:lang w:val="ru-RU" w:eastAsia="ru-RU"/>
             </w:rPr>
           </w:pPr>
-          <w:hyperlink w:anchor="_Toc213439995" w:history="1">
+          <w:hyperlink w:anchor="_Toc229746180" w:history="1">
             <w:r>
               <w:rPr>
                 <w:rStyle w:val="Hyperlink"/>
+                <w:noProof/>
               </w:rPr>
               <w:t>3. Izstrādes līdzekļu, rīku apraksts un izvēles pamatojums</w:t>
             </w:r>
             <w:r>
               <w:rPr>
+                <w:noProof/>
                 <w:webHidden/>
               </w:rPr>
               <w:tab/>
             </w:r>
             <w:r>
               <w:rPr>
+                <w:noProof/>
                 <w:webHidden/>
               </w:rPr>
               <w:fldChar w:fldCharType="begin"/>
             </w:r>
             <w:r>
               <w:rPr>
+                <w:noProof/>
                 <w:webHidden/>
               </w:rPr>
-              <w:instrText xml:space="preserve"> PAGEREF _Toc213439995 \h </w:instrText>
-            </w:r>
-            <w:r>
-              <w:rPr>
+              <w:instrText xml:space="preserve"> PAGEREF _Toc229746180 \h </w:instrText>
+            </w:r>
+            <w:r>
+              <w:rPr>
+                <w:noProof/>
                 <w:webHidden/>
               </w:rPr>
             </w:r>
             <w:r>
               <w:rPr>
+                <w:noProof/>
                 <w:webHidden/>
               </w:rPr>
               <w:fldChar w:fldCharType="separate"/>
             </w:r>
             <w:r>
               <w:rPr>
+                <w:noProof/>
                 <w:webHidden/>
               </w:rPr>
-              <w:t>15</w:t>
-            </w:r>
-            <w:r>
-              <w:rPr>
+              <w:t>19</w:t>
+            </w:r>
+            <w:r>
+              <w:rPr>
+                <w:noProof/>
                 <w:webHidden/>
               </w:rPr>
               <w:fldChar w:fldCharType="end"/>
@@ -1357,54 +1501,63 @@
             <w:pStyle w:val="TOC2"/>
             <w:rPr>
               <w:rFonts w:asciiTheme="minorHAnsi" w:eastAsiaTheme="minorEastAsia" w:hAnsiTheme="minorHAnsi"/>
+              <w:noProof/>
               <w:color w:val="auto"/>
-              <w:lang w:eastAsia="ru-RU"/>
+              <w:lang w:val="ru-RU" w:eastAsia="ru-RU"/>
             </w:rPr>
           </w:pPr>
-          <w:hyperlink w:anchor="_Toc213439996" w:history="1">
+          <w:hyperlink w:anchor="_Toc229746181" w:history="1">
             <w:r>
               <w:rPr>
                 <w:rStyle w:val="Hyperlink"/>
+                <w:noProof/>
               </w:rPr>
               <w:t>3.1. Izvēlēto risinājuma līdzekļu un valodu apraksts</w:t>
             </w:r>
             <w:r>
               <w:rPr>
+                <w:noProof/>
                 <w:webHidden/>
               </w:rPr>
               <w:tab/>
             </w:r>
             <w:r>
               <w:rPr>
+                <w:noProof/>
                 <w:webHidden/>
               </w:rPr>
               <w:fldChar w:fldCharType="begin"/>
             </w:r>
             <w:r>
               <w:rPr>
+                <w:noProof/>
                 <w:webHidden/>
               </w:rPr>
-              <w:instrText xml:space="preserve"> PAGEREF _Toc213439996 \h </w:instrText>
-            </w:r>
-            <w:r>
-              <w:rPr>
+              <w:instrText xml:space="preserve"> PAGEREF _Toc229746181 \h </w:instrText>
+            </w:r>
+            <w:r>
+              <w:rPr>
+                <w:noProof/>
                 <w:webHidden/>
               </w:rPr>
             </w:r>
             <w:r>
               <w:rPr>
+                <w:noProof/>
                 <w:webHidden/>
               </w:rPr>
               <w:fldChar w:fldCharType="separate"/>
             </w:r>
             <w:r>
               <w:rPr>
+                <w:noProof/>
                 <w:webHidden/>
               </w:rPr>
-              <w:t>15</w:t>
-            </w:r>
-            <w:r>
-              <w:rPr>
+              <w:t>19</w:t>
+            </w:r>
+            <w:r>
+              <w:rPr>
+                <w:noProof/>
                 <w:webHidden/>
               </w:rPr>
               <w:fldChar w:fldCharType="end"/>
@@ -1416,54 +1569,63 @@
             <w:pStyle w:val="TOC2"/>
             <w:rPr>
               <w:rFonts w:asciiTheme="minorHAnsi" w:eastAsiaTheme="minorEastAsia" w:hAnsiTheme="minorHAnsi"/>
+              <w:noProof/>
               <w:color w:val="auto"/>
-              <w:lang w:eastAsia="ru-RU"/>
+              <w:lang w:val="ru-RU" w:eastAsia="ru-RU"/>
             </w:rPr>
           </w:pPr>
-          <w:hyperlink w:anchor="_Toc213439997" w:history="1">
+          <w:hyperlink w:anchor="_Toc229746182" w:history="1">
             <w:r>
               <w:rPr>
                 <w:rStyle w:val="Hyperlink"/>
+                <w:noProof/>
               </w:rPr>
               <w:t>3.2. Iespējamo (alternatīvo) risinājuma līdzekļu un valodu apraksts</w:t>
             </w:r>
             <w:r>
               <w:rPr>
+                <w:noProof/>
                 <w:webHidden/>
               </w:rPr>
               <w:tab/>
             </w:r>
             <w:r>
               <w:rPr>
+                <w:noProof/>
                 <w:webHidden/>
               </w:rPr>
               <w:fldChar w:fldCharType="begin"/>
             </w:r>
             <w:r>
               <w:rPr>
+                <w:noProof/>
                 <w:webHidden/>
               </w:rPr>
-              <w:instrText xml:space="preserve"> PAGEREF _Toc213439997 \h </w:instrText>
-            </w:r>
-            <w:r>
-              <w:rPr>
+              <w:instrText xml:space="preserve"> PAGEREF _Toc229746182 \h </w:instrText>
+            </w:r>
+            <w:r>
+              <w:rPr>
+                <w:noProof/>
                 <w:webHidden/>
               </w:rPr>
             </w:r>
             <w:r>
               <w:rPr>
+                <w:noProof/>
                 <w:webHidden/>
               </w:rPr>
               <w:fldChar w:fldCharType="separate"/>
             </w:r>
             <w:r>
               <w:rPr>
+                <w:noProof/>
                 <w:webHidden/>
               </w:rPr>
-              <w:t>17</w:t>
-            </w:r>
-            <w:r>
-              <w:rPr>
+              <w:t>20</w:t>
+            </w:r>
+            <w:r>
+              <w:rPr>
+                <w:noProof/>
                 <w:webHidden/>
               </w:rPr>
               <w:fldChar w:fldCharType="end"/>
@@ -1475,54 +1637,63 @@
             <w:pStyle w:val="TOC1"/>
             <w:rPr>
               <w:rFonts w:asciiTheme="minorHAnsi" w:eastAsiaTheme="minorEastAsia" w:hAnsiTheme="minorHAnsi"/>
+              <w:noProof/>
               <w:color w:val="auto"/>
-              <w:lang w:eastAsia="ru-RU"/>
+              <w:lang w:val="ru-RU" w:eastAsia="ru-RU"/>
             </w:rPr>
           </w:pPr>
-          <w:hyperlink w:anchor="_Toc213439998" w:history="1">
+          <w:hyperlink w:anchor="_Toc229746183" w:history="1">
             <w:r>
               <w:rPr>
                 <w:rStyle w:val="Hyperlink"/>
+                <w:noProof/>
               </w:rPr>
               <w:t>4. Sistēmas modelēšana un projektēšana</w:t>
             </w:r>
             <w:r>
               <w:rPr>
+                <w:noProof/>
                 <w:webHidden/>
               </w:rPr>
               <w:tab/>
             </w:r>
             <w:r>
               <w:rPr>
+                <w:noProof/>
                 <w:webHidden/>
               </w:rPr>
               <w:fldChar w:fldCharType="begin"/>
             </w:r>
             <w:r>
               <w:rPr>
+                <w:noProof/>
                 <w:webHidden/>
               </w:rPr>
-              <w:instrText xml:space="preserve"> PAGEREF _Toc213439998 \h </w:instrText>
-            </w:r>
-            <w:r>
-              <w:rPr>
+              <w:instrText xml:space="preserve"> PAGEREF _Toc229746183 \h </w:instrText>
+            </w:r>
+            <w:r>
+              <w:rPr>
+                <w:noProof/>
                 <w:webHidden/>
               </w:rPr>
             </w:r>
             <w:r>
               <w:rPr>
+                <w:noProof/>
                 <w:webHidden/>
               </w:rPr>
               <w:fldChar w:fldCharType="separate"/>
             </w:r>
             <w:r>
               <w:rPr>
+                <w:noProof/>
                 <w:webHidden/>
               </w:rPr>
-              <w:t>18</w:t>
-            </w:r>
-            <w:r>
-              <w:rPr>
+              <w:t>22</w:t>
+            </w:r>
+            <w:r>
+              <w:rPr>
+                <w:noProof/>
                 <w:webHidden/>
               </w:rPr>
               <w:fldChar w:fldCharType="end"/>
@@ -1534,54 +1705,63 @@
             <w:pStyle w:val="TOC2"/>
             <w:rPr>
               <w:rFonts w:asciiTheme="minorHAnsi" w:eastAsiaTheme="minorEastAsia" w:hAnsiTheme="minorHAnsi"/>
+              <w:noProof/>
               <w:color w:val="auto"/>
-              <w:lang w:eastAsia="ru-RU"/>
+              <w:lang w:val="ru-RU" w:eastAsia="ru-RU"/>
             </w:rPr>
           </w:pPr>
-          <w:hyperlink w:anchor="_Toc213439999" w:history="1">
+          <w:hyperlink w:anchor="_Toc229746184" w:history="1">
             <w:r>
               <w:rPr>
                 <w:rStyle w:val="Hyperlink"/>
+                <w:noProof/>
               </w:rPr>
               <w:t>4.1. Sistēmas struktūras modelis</w:t>
             </w:r>
             <w:r>
               <w:rPr>
+                <w:noProof/>
                 <w:webHidden/>
               </w:rPr>
               <w:tab/>
             </w:r>
             <w:r>
               <w:rPr>
+                <w:noProof/>
                 <w:webHidden/>
               </w:rPr>
               <w:fldChar w:fldCharType="begin"/>
             </w:r>
             <w:r>
               <w:rPr>
+                <w:noProof/>
                 <w:webHidden/>
               </w:rPr>
-              <w:instrText xml:space="preserve"> PAGEREF _Toc213439999 \h </w:instrText>
-            </w:r>
-            <w:r>
-              <w:rPr>
+              <w:instrText xml:space="preserve"> PAGEREF _Toc229746184 \h </w:instrText>
+            </w:r>
+            <w:r>
+              <w:rPr>
+                <w:noProof/>
                 <w:webHidden/>
               </w:rPr>
             </w:r>
             <w:r>
               <w:rPr>
+                <w:noProof/>
                 <w:webHidden/>
               </w:rPr>
               <w:fldChar w:fldCharType="separate"/>
             </w:r>
             <w:r>
               <w:rPr>
+                <w:noProof/>
                 <w:webHidden/>
               </w:rPr>
-              <w:t>18</w:t>
-            </w:r>
-            <w:r>
-              <w:rPr>
+              <w:t>22</w:t>
+            </w:r>
+            <w:r>
+              <w:rPr>
+                <w:noProof/>
                 <w:webHidden/>
               </w:rPr>
               <w:fldChar w:fldCharType="end"/>
@@ -1596,54 +1776,63 @@
             </w:tabs>
             <w:rPr>
               <w:rFonts w:asciiTheme="minorHAnsi" w:eastAsiaTheme="minorEastAsia" w:hAnsiTheme="minorHAnsi"/>
+              <w:noProof/>
               <w:color w:val="auto"/>
-              <w:lang w:eastAsia="ru-RU"/>
+              <w:lang w:val="ru-RU" w:eastAsia="ru-RU"/>
             </w:rPr>
           </w:pPr>
-          <w:hyperlink w:anchor="_Toc213440000" w:history="1">
+          <w:hyperlink w:anchor="_Toc229746185" w:history="1">
             <w:r>
               <w:rPr>
                 <w:rStyle w:val="Hyperlink"/>
-              </w:rPr>
-              <w:t>4.1.1. Sistēmas struktūra (izvietojuma diagramma / komponenšu diagramma *)</w:t>
-            </w:r>
-            <w:r>
-              <w:rPr>
+                <w:noProof/>
+              </w:rPr>
+              <w:t>4.1.1. Sistēmas struktūra (Izvietojuma diagramma)</w:t>
+            </w:r>
+            <w:r>
+              <w:rPr>
+                <w:noProof/>
                 <w:webHidden/>
               </w:rPr>
               <w:tab/>
             </w:r>
             <w:r>
               <w:rPr>
+                <w:noProof/>
                 <w:webHidden/>
               </w:rPr>
               <w:fldChar w:fldCharType="begin"/>
             </w:r>
             <w:r>
               <w:rPr>
+                <w:noProof/>
                 <w:webHidden/>
               </w:rPr>
-              <w:instrText xml:space="preserve"> PAGEREF _Toc213440000 \h </w:instrText>
-            </w:r>
-            <w:r>
-              <w:rPr>
+              <w:instrText xml:space="preserve"> PAGEREF _Toc229746185 \h </w:instrText>
+            </w:r>
+            <w:r>
+              <w:rPr>
+                <w:noProof/>
                 <w:webHidden/>
               </w:rPr>
             </w:r>
             <w:r>
               <w:rPr>
+                <w:noProof/>
                 <w:webHidden/>
               </w:rPr>
               <w:fldChar w:fldCharType="separate"/>
             </w:r>
             <w:r>
               <w:rPr>
+                <w:noProof/>
                 <w:webHidden/>
               </w:rPr>
-              <w:t>18</w:t>
-            </w:r>
-            <w:r>
-              <w:rPr>
+              <w:t>22</w:t>
+            </w:r>
+            <w:r>
+              <w:rPr>
+                <w:noProof/>
                 <w:webHidden/>
               </w:rPr>
               <w:fldChar w:fldCharType="end"/>
@@ -1658,54 +1847,63 @@
             </w:tabs>
             <w:rPr>
               <w:rFonts w:asciiTheme="minorHAnsi" w:eastAsiaTheme="minorEastAsia" w:hAnsiTheme="minorHAnsi"/>
+              <w:noProof/>
               <w:color w:val="auto"/>
-              <w:lang w:eastAsia="ru-RU"/>
+              <w:lang w:val="ru-RU" w:eastAsia="ru-RU"/>
             </w:rPr>
           </w:pPr>
-          <w:hyperlink w:anchor="_Toc213440001" w:history="1">
+          <w:hyperlink w:anchor="_Toc229746186" w:history="1">
             <w:r>
               <w:rPr>
                 <w:rStyle w:val="Hyperlink"/>
-              </w:rPr>
-              <w:t>4.1.2. Klašu diagramma / ER diagramma</w:t>
-            </w:r>
-            <w:r>
-              <w:rPr>
+                <w:noProof/>
+              </w:rPr>
+              <w:t>4.1.2. ER diagramma</w:t>
+            </w:r>
+            <w:r>
+              <w:rPr>
+                <w:noProof/>
                 <w:webHidden/>
               </w:rPr>
               <w:tab/>
             </w:r>
             <w:r>
               <w:rPr>
+                <w:noProof/>
                 <w:webHidden/>
               </w:rPr>
               <w:fldChar w:fldCharType="begin"/>
             </w:r>
             <w:r>
               <w:rPr>
+                <w:noProof/>
                 <w:webHidden/>
               </w:rPr>
-              <w:instrText xml:space="preserve"> PAGEREF _Toc213440001 \h </w:instrText>
-            </w:r>
-            <w:r>
-              <w:rPr>
+              <w:instrText xml:space="preserve"> PAGEREF _Toc229746186 \h </w:instrText>
+            </w:r>
+            <w:r>
+              <w:rPr>
+                <w:noProof/>
                 <w:webHidden/>
               </w:rPr>
             </w:r>
             <w:r>
               <w:rPr>
+                <w:noProof/>
                 <w:webHidden/>
               </w:rPr>
               <w:fldChar w:fldCharType="separate"/>
             </w:r>
             <w:r>
               <w:rPr>
+                <w:noProof/>
                 <w:webHidden/>
               </w:rPr>
-              <w:t>18</w:t>
-            </w:r>
-            <w:r>
-              <w:rPr>
+              <w:t>23</w:t>
+            </w:r>
+            <w:r>
+              <w:rPr>
+                <w:noProof/>
                 <w:webHidden/>
               </w:rPr>
               <w:fldChar w:fldCharType="end"/>
@@ -1717,54 +1915,63 @@
             <w:pStyle w:val="TOC2"/>
             <w:rPr>
               <w:rFonts w:asciiTheme="minorHAnsi" w:eastAsiaTheme="minorEastAsia" w:hAnsiTheme="minorHAnsi"/>
+              <w:noProof/>
               <w:color w:val="auto"/>
-              <w:lang w:eastAsia="ru-RU"/>
+              <w:lang w:val="ru-RU" w:eastAsia="ru-RU"/>
             </w:rPr>
           </w:pPr>
-          <w:hyperlink w:anchor="_Toc213440002" w:history="1">
+          <w:hyperlink w:anchor="_Toc229746187" w:history="1">
             <w:r>
               <w:rPr>
                 <w:rStyle w:val="Hyperlink"/>
+                <w:noProof/>
               </w:rPr>
               <w:t>4.2. Funkcionālais un dinamiskais sistēmas modelis</w:t>
             </w:r>
             <w:r>
               <w:rPr>
+                <w:noProof/>
                 <w:webHidden/>
               </w:rPr>
               <w:tab/>
             </w:r>
             <w:r>
               <w:rPr>
+                <w:noProof/>
                 <w:webHidden/>
               </w:rPr>
               <w:fldChar w:fldCharType="begin"/>
             </w:r>
             <w:r>
               <w:rPr>
+                <w:noProof/>
                 <w:webHidden/>
               </w:rPr>
-              <w:instrText xml:space="preserve"> PAGEREF _Toc213440002 \h </w:instrText>
-            </w:r>
-            <w:r>
-              <w:rPr>
+              <w:instrText xml:space="preserve"> PAGEREF _Toc229746187 \h </w:instrText>
+            </w:r>
+            <w:r>
+              <w:rPr>
+                <w:noProof/>
                 <w:webHidden/>
               </w:rPr>
             </w:r>
             <w:r>
               <w:rPr>
+                <w:noProof/>
                 <w:webHidden/>
               </w:rPr>
               <w:fldChar w:fldCharType="separate"/>
             </w:r>
             <w:r>
               <w:rPr>
+                <w:noProof/>
                 <w:webHidden/>
               </w:rPr>
-              <w:t>18</w:t>
-            </w:r>
-            <w:r>
-              <w:rPr>
+              <w:t>23</w:t>
+            </w:r>
+            <w:r>
+              <w:rPr>
+                <w:noProof/>
                 <w:webHidden/>
               </w:rPr>
               <w:fldChar w:fldCharType="end"/>
@@ -1779,54 +1986,63 @@
             </w:tabs>
             <w:rPr>
               <w:rFonts w:asciiTheme="minorHAnsi" w:eastAsiaTheme="minorEastAsia" w:hAnsiTheme="minorHAnsi"/>
+              <w:noProof/>
               <w:color w:val="auto"/>
-              <w:lang w:eastAsia="ru-RU"/>
+              <w:lang w:val="ru-RU" w:eastAsia="ru-RU"/>
             </w:rPr>
           </w:pPr>
-          <w:hyperlink w:anchor="_Toc213440003" w:history="1">
+          <w:hyperlink w:anchor="_Toc229746188" w:history="1">
             <w:r>
               <w:rPr>
                 <w:rStyle w:val="Hyperlink"/>
+                <w:noProof/>
               </w:rPr>
               <w:t>4.2.1. Lietojumgadījumu diagramma (Use Case)</w:t>
             </w:r>
             <w:r>
               <w:rPr>
+                <w:noProof/>
                 <w:webHidden/>
               </w:rPr>
               <w:tab/>
             </w:r>
             <w:r>
               <w:rPr>
+                <w:noProof/>
                 <w:webHidden/>
               </w:rPr>
               <w:fldChar w:fldCharType="begin"/>
             </w:r>
             <w:r>
               <w:rPr>
+                <w:noProof/>
                 <w:webHidden/>
               </w:rPr>
-              <w:instrText xml:space="preserve"> PAGEREF _Toc213440003 \h </w:instrText>
-            </w:r>
-            <w:r>
-              <w:rPr>
+              <w:instrText xml:space="preserve"> PAGEREF _Toc229746188 \h </w:instrText>
+            </w:r>
+            <w:r>
+              <w:rPr>
+                <w:noProof/>
                 <w:webHidden/>
               </w:rPr>
             </w:r>
             <w:r>
               <w:rPr>
+                <w:noProof/>
                 <w:webHidden/>
               </w:rPr>
               <w:fldChar w:fldCharType="separate"/>
             </w:r>
             <w:r>
               <w:rPr>
+                <w:noProof/>
                 <w:webHidden/>
               </w:rPr>
-              <w:t>18</w:t>
-            </w:r>
-            <w:r>
-              <w:rPr>
+              <w:t>24</w:t>
+            </w:r>
+            <w:r>
+              <w:rPr>
+                <w:noProof/>
                 <w:webHidden/>
               </w:rPr>
               <w:fldChar w:fldCharType="end"/>
@@ -1841,54 +2057,63 @@
             </w:tabs>
             <w:rPr>
               <w:rFonts w:asciiTheme="minorHAnsi" w:eastAsiaTheme="minorEastAsia" w:hAnsiTheme="minorHAnsi"/>
+              <w:noProof/>
               <w:color w:val="auto"/>
-              <w:lang w:eastAsia="ru-RU"/>
+              <w:lang w:val="ru-RU" w:eastAsia="ru-RU"/>
             </w:rPr>
           </w:pPr>
-          <w:hyperlink w:anchor="_Toc213440004" w:history="1">
+          <w:hyperlink w:anchor="_Toc229746189" w:history="1">
             <w:r>
               <w:rPr>
                 <w:rStyle w:val="Hyperlink"/>
+                <w:noProof/>
               </w:rPr>
               <w:t>4.2.2. Aktivitāšu diagramma (Activity)</w:t>
             </w:r>
             <w:r>
               <w:rPr>
+                <w:noProof/>
                 <w:webHidden/>
               </w:rPr>
               <w:tab/>
             </w:r>
             <w:r>
               <w:rPr>
+                <w:noProof/>
                 <w:webHidden/>
               </w:rPr>
               <w:fldChar w:fldCharType="begin"/>
             </w:r>
             <w:r>
               <w:rPr>
+                <w:noProof/>
                 <w:webHidden/>
               </w:rPr>
-              <w:instrText xml:space="preserve"> PAGEREF _Toc213440004 \h </w:instrText>
-            </w:r>
-            <w:r>
-              <w:rPr>
+              <w:instrText xml:space="preserve"> PAGEREF _Toc229746189 \h </w:instrText>
+            </w:r>
+            <w:r>
+              <w:rPr>
+                <w:noProof/>
                 <w:webHidden/>
               </w:rPr>
             </w:r>
             <w:r>
               <w:rPr>
+                <w:noProof/>
                 <w:webHidden/>
               </w:rPr>
               <w:fldChar w:fldCharType="separate"/>
             </w:r>
             <w:r>
               <w:rPr>
+                <w:noProof/>
                 <w:webHidden/>
               </w:rPr>
-              <w:t>18</w:t>
-            </w:r>
-            <w:r>
-              <w:rPr>
+              <w:t>24</w:t>
+            </w:r>
+            <w:r>
+              <w:rPr>
+                <w:noProof/>
                 <w:webHidden/>
               </w:rPr>
               <w:fldChar w:fldCharType="end"/>
@@ -1903,54 +2128,63 @@
             </w:tabs>
             <w:rPr>
               <w:rFonts w:asciiTheme="minorHAnsi" w:eastAsiaTheme="minorEastAsia" w:hAnsiTheme="minorHAnsi"/>
+              <w:noProof/>
               <w:color w:val="auto"/>
-              <w:lang w:eastAsia="ru-RU"/>
+              <w:lang w:val="ru-RU" w:eastAsia="ru-RU"/>
             </w:rPr>
           </w:pPr>
-          <w:hyperlink w:anchor="_Toc213440005" w:history="1">
+          <w:hyperlink w:anchor="_Toc229746190" w:history="1">
             <w:r>
               <w:rPr>
                 <w:rStyle w:val="Hyperlink"/>
+                <w:noProof/>
               </w:rPr>
               <w:t>4.2.3. Stāvokļu diagramma (State)</w:t>
             </w:r>
             <w:r>
               <w:rPr>
+                <w:noProof/>
                 <w:webHidden/>
               </w:rPr>
               <w:tab/>
             </w:r>
             <w:r>
               <w:rPr>
+                <w:noProof/>
                 <w:webHidden/>
               </w:rPr>
               <w:fldChar w:fldCharType="begin"/>
             </w:r>
             <w:r>
               <w:rPr>
+                <w:noProof/>
                 <w:webHidden/>
               </w:rPr>
-              <w:instrText xml:space="preserve"> PAGEREF _Toc213440005 \h </w:instrText>
-            </w:r>
-            <w:r>
-              <w:rPr>
+              <w:instrText xml:space="preserve"> PAGEREF _Toc229746190 \h </w:instrText>
+            </w:r>
+            <w:r>
+              <w:rPr>
+                <w:noProof/>
                 <w:webHidden/>
               </w:rPr>
             </w:r>
             <w:r>
               <w:rPr>
+                <w:noProof/>
                 <w:webHidden/>
               </w:rPr>
               <w:fldChar w:fldCharType="separate"/>
             </w:r>
             <w:r>
               <w:rPr>
+                <w:noProof/>
                 <w:webHidden/>
               </w:rPr>
-              <w:t>18</w:t>
-            </w:r>
-            <w:r>
-              <w:rPr>
+              <w:t>25</w:t>
+            </w:r>
+            <w:r>
+              <w:rPr>
+                <w:noProof/>
                 <w:webHidden/>
               </w:rPr>
               <w:fldChar w:fldCharType="end"/>
@@ -1962,54 +2196,63 @@
             <w:pStyle w:val="TOC2"/>
             <w:rPr>
               <w:rFonts w:asciiTheme="minorHAnsi" w:eastAsiaTheme="minorEastAsia" w:hAnsiTheme="minorHAnsi"/>
+              <w:noProof/>
               <w:color w:val="auto"/>
-              <w:lang w:eastAsia="ru-RU"/>
+              <w:lang w:val="ru-RU" w:eastAsia="ru-RU"/>
             </w:rPr>
           </w:pPr>
-          <w:hyperlink w:anchor="_Toc213440006" w:history="1">
+          <w:hyperlink w:anchor="_Toc229746191" w:history="1">
             <w:r>
               <w:rPr>
                 <w:rStyle w:val="Hyperlink"/>
+                <w:noProof/>
               </w:rPr>
               <w:t>4.3. Datu struktūru apraksts</w:t>
             </w:r>
             <w:r>
               <w:rPr>
+                <w:noProof/>
                 <w:webHidden/>
               </w:rPr>
               <w:tab/>
             </w:r>
             <w:r>
               <w:rPr>
+                <w:noProof/>
                 <w:webHidden/>
               </w:rPr>
               <w:fldChar w:fldCharType="begin"/>
             </w:r>
             <w:r>
               <w:rPr>
+                <w:noProof/>
                 <w:webHidden/>
               </w:rPr>
-              <w:instrText xml:space="preserve"> PAGEREF _Toc213440006 \h </w:instrText>
-            </w:r>
-            <w:r>
-              <w:rPr>
+              <w:instrText xml:space="preserve"> PAGEREF _Toc229746191 \h </w:instrText>
+            </w:r>
+            <w:r>
+              <w:rPr>
+                <w:noProof/>
                 <w:webHidden/>
               </w:rPr>
             </w:r>
             <w:r>
               <w:rPr>
+                <w:noProof/>
                 <w:webHidden/>
               </w:rPr>
               <w:fldChar w:fldCharType="separate"/>
             </w:r>
             <w:r>
               <w:rPr>
+                <w:noProof/>
                 <w:webHidden/>
               </w:rPr>
-              <w:t>18</w:t>
-            </w:r>
-            <w:r>
-              <w:rPr>
+              <w:t>26</w:t>
+            </w:r>
+            <w:r>
+              <w:rPr>
+                <w:noProof/>
                 <w:webHidden/>
               </w:rPr>
               <w:fldChar w:fldCharType="end"/>
@@ -2021,54 +2264,63 @@
             <w:pStyle w:val="TOC1"/>
             <w:rPr>
               <w:rFonts w:asciiTheme="minorHAnsi" w:eastAsiaTheme="minorEastAsia" w:hAnsiTheme="minorHAnsi"/>
+              <w:noProof/>
               <w:color w:val="auto"/>
-              <w:lang w:eastAsia="ru-RU"/>
+              <w:lang w:val="ru-RU" w:eastAsia="ru-RU"/>
             </w:rPr>
           </w:pPr>
-          <w:hyperlink w:anchor="_Toc213440007" w:history="1">
+          <w:hyperlink w:anchor="_Toc229746192" w:history="1">
             <w:r>
               <w:rPr>
                 <w:rStyle w:val="Hyperlink"/>
+                <w:noProof/>
               </w:rPr>
               <w:t>5. Lietotāju ceļvedis</w:t>
             </w:r>
             <w:r>
               <w:rPr>
+                <w:noProof/>
                 <w:webHidden/>
               </w:rPr>
               <w:tab/>
             </w:r>
             <w:r>
               <w:rPr>
+                <w:noProof/>
                 <w:webHidden/>
               </w:rPr>
               <w:fldChar w:fldCharType="begin"/>
             </w:r>
             <w:r>
               <w:rPr>
+                <w:noProof/>
                 <w:webHidden/>
               </w:rPr>
-              <w:instrText xml:space="preserve"> PAGEREF _Toc213440007 \h </w:instrText>
-            </w:r>
-            <w:r>
-              <w:rPr>
+              <w:instrText xml:space="preserve"> PAGEREF _Toc229746192 \h </w:instrText>
+            </w:r>
+            <w:r>
+              <w:rPr>
+                <w:noProof/>
                 <w:webHidden/>
               </w:rPr>
             </w:r>
             <w:r>
               <w:rPr>
+                <w:noProof/>
                 <w:webHidden/>
               </w:rPr>
               <w:fldChar w:fldCharType="separate"/>
             </w:r>
             <w:r>
               <w:rPr>
+                <w:noProof/>
                 <w:webHidden/>
               </w:rPr>
-              <w:t>19</w:t>
-            </w:r>
-            <w:r>
-              <w:rPr>
+              <w:t>28</w:t>
+            </w:r>
+            <w:r>
+              <w:rPr>
+                <w:noProof/>
                 <w:webHidden/>
               </w:rPr>
               <w:fldChar w:fldCharType="end"/>
@@ -2080,54 +2332,63 @@
             <w:pStyle w:val="TOC1"/>
             <w:rPr>
               <w:rFonts w:asciiTheme="minorHAnsi" w:eastAsiaTheme="minorEastAsia" w:hAnsiTheme="minorHAnsi"/>
+              <w:noProof/>
               <w:color w:val="auto"/>
-              <w:lang w:eastAsia="ru-RU"/>
+              <w:lang w:val="ru-RU" w:eastAsia="ru-RU"/>
             </w:rPr>
           </w:pPr>
-          <w:hyperlink w:anchor="_Toc213440008" w:history="1">
+          <w:hyperlink w:anchor="_Toc229746193" w:history="1">
             <w:r>
               <w:rPr>
                 <w:rStyle w:val="Hyperlink"/>
+                <w:noProof/>
               </w:rPr>
               <w:t>6. Testēšanas dokumentācija</w:t>
             </w:r>
             <w:r>
               <w:rPr>
+                <w:noProof/>
                 <w:webHidden/>
               </w:rPr>
               <w:tab/>
             </w:r>
             <w:r>
               <w:rPr>
+                <w:noProof/>
                 <w:webHidden/>
               </w:rPr>
               <w:fldChar w:fldCharType="begin"/>
             </w:r>
             <w:r>
               <w:rPr>
+                <w:noProof/>
                 <w:webHidden/>
               </w:rPr>
-              <w:instrText xml:space="preserve"> PAGEREF _Toc213440008 \h </w:instrText>
-            </w:r>
-            <w:r>
-              <w:rPr>
+              <w:instrText xml:space="preserve"> PAGEREF _Toc229746193 \h </w:instrText>
+            </w:r>
+            <w:r>
+              <w:rPr>
+                <w:noProof/>
                 <w:webHidden/>
               </w:rPr>
             </w:r>
             <w:r>
               <w:rPr>
+                <w:noProof/>
                 <w:webHidden/>
               </w:rPr>
               <w:fldChar w:fldCharType="separate"/>
             </w:r>
             <w:r>
               <w:rPr>
+                <w:noProof/>
                 <w:webHidden/>
               </w:rPr>
-              <w:t>20</w:t>
-            </w:r>
-            <w:r>
-              <w:rPr>
+              <w:t>29</w:t>
+            </w:r>
+            <w:r>
+              <w:rPr>
+                <w:noProof/>
                 <w:webHidden/>
               </w:rPr>
               <w:fldChar w:fldCharType="end"/>
@@ -2139,54 +2400,63 @@
             <w:pStyle w:val="TOC2"/>
             <w:rPr>
               <w:rFonts w:asciiTheme="minorHAnsi" w:eastAsiaTheme="minorEastAsia" w:hAnsiTheme="minorHAnsi"/>
+              <w:noProof/>
               <w:color w:val="auto"/>
-              <w:lang w:eastAsia="ru-RU"/>
+              <w:lang w:val="ru-RU" w:eastAsia="ru-RU"/>
             </w:rPr>
           </w:pPr>
-          <w:hyperlink w:anchor="_Toc213440009" w:history="1">
+          <w:hyperlink w:anchor="_Toc229746194" w:history="1">
             <w:r>
               <w:rPr>
                 <w:rStyle w:val="Hyperlink"/>
+                <w:noProof/>
               </w:rPr>
               <w:t>6.1. Izvēlētās testēšanas metodes, rīku apraksts un pamatojums</w:t>
             </w:r>
             <w:r>
               <w:rPr>
+                <w:noProof/>
                 <w:webHidden/>
               </w:rPr>
               <w:tab/>
             </w:r>
             <w:r>
               <w:rPr>
+                <w:noProof/>
                 <w:webHidden/>
               </w:rPr>
               <w:fldChar w:fldCharType="begin"/>
             </w:r>
             <w:r>
               <w:rPr>
+                <w:noProof/>
                 <w:webHidden/>
               </w:rPr>
-              <w:instrText xml:space="preserve"> PAGEREF _Toc213440009 \h </w:instrText>
-            </w:r>
-            <w:r>
-              <w:rPr>
+              <w:instrText xml:space="preserve"> PAGEREF _Toc229746194 \h </w:instrText>
+            </w:r>
+            <w:r>
+              <w:rPr>
+                <w:noProof/>
                 <w:webHidden/>
               </w:rPr>
             </w:r>
             <w:r>
               <w:rPr>
+                <w:noProof/>
                 <w:webHidden/>
               </w:rPr>
               <w:fldChar w:fldCharType="separate"/>
             </w:r>
             <w:r>
               <w:rPr>
+                <w:noProof/>
                 <w:webHidden/>
               </w:rPr>
-              <w:t>20</w:t>
-            </w:r>
-            <w:r>
-              <w:rPr>
+              <w:t>29</w:t>
+            </w:r>
+            <w:r>
+              <w:rPr>
+                <w:noProof/>
                 <w:webHidden/>
               </w:rPr>
               <w:fldChar w:fldCharType="end"/>
@@ -2198,54 +2468,63 @@
             <w:pStyle w:val="TOC2"/>
             <w:rPr>
               <w:rFonts w:asciiTheme="minorHAnsi" w:eastAsiaTheme="minorEastAsia" w:hAnsiTheme="minorHAnsi"/>
+              <w:noProof/>
               <w:color w:val="auto"/>
-              <w:lang w:eastAsia="ru-RU"/>
+              <w:lang w:val="ru-RU" w:eastAsia="ru-RU"/>
             </w:rPr>
           </w:pPr>
-          <w:hyperlink w:anchor="_Toc213440010" w:history="1">
+          <w:hyperlink w:anchor="_Toc229746195" w:history="1">
             <w:r>
               <w:rPr>
                 <w:rStyle w:val="Hyperlink"/>
+                <w:noProof/>
               </w:rPr>
               <w:t>6.2. Testpiemēru kopa</w:t>
             </w:r>
             <w:r>
               <w:rPr>
+                <w:noProof/>
                 <w:webHidden/>
               </w:rPr>
               <w:tab/>
             </w:r>
             <w:r>
               <w:rPr>
+                <w:noProof/>
                 <w:webHidden/>
               </w:rPr>
               <w:fldChar w:fldCharType="begin"/>
             </w:r>
             <w:r>
               <w:rPr>
+                <w:noProof/>
                 <w:webHidden/>
               </w:rPr>
-              <w:instrText xml:space="preserve"> PAGEREF _Toc213440010 \h </w:instrText>
-            </w:r>
-            <w:r>
-              <w:rPr>
+              <w:instrText xml:space="preserve"> PAGEREF _Toc229746195 \h </w:instrText>
+            </w:r>
+            <w:r>
+              <w:rPr>
+                <w:noProof/>
                 <w:webHidden/>
               </w:rPr>
             </w:r>
             <w:r>
               <w:rPr>
+                <w:noProof/>
                 <w:webHidden/>
               </w:rPr>
               <w:fldChar w:fldCharType="separate"/>
             </w:r>
             <w:r>
               <w:rPr>
+                <w:noProof/>
                 <w:webHidden/>
               </w:rPr>
-              <w:t>20</w:t>
-            </w:r>
-            <w:r>
-              <w:rPr>
+              <w:t>30</w:t>
+            </w:r>
+            <w:r>
+              <w:rPr>
+                <w:noProof/>
                 <w:webHidden/>
               </w:rPr>
               <w:fldChar w:fldCharType="end"/>
@@ -2257,54 +2536,63 @@
             <w:pStyle w:val="TOC2"/>
             <w:rPr>
               <w:rFonts w:asciiTheme="minorHAnsi" w:eastAsiaTheme="minorEastAsia" w:hAnsiTheme="minorHAnsi"/>
+              <w:noProof/>
               <w:color w:val="auto"/>
-              <w:lang w:eastAsia="ru-RU"/>
+              <w:lang w:val="ru-RU" w:eastAsia="ru-RU"/>
             </w:rPr>
           </w:pPr>
-          <w:hyperlink w:anchor="_Toc213440011" w:history="1">
+          <w:hyperlink w:anchor="_Toc229746196" w:history="1">
             <w:r>
               <w:rPr>
                 <w:rStyle w:val="Hyperlink"/>
+                <w:noProof/>
               </w:rPr>
               <w:t>6.3. Testēšanas žurnāls</w:t>
             </w:r>
             <w:r>
               <w:rPr>
+                <w:noProof/>
                 <w:webHidden/>
               </w:rPr>
               <w:tab/>
             </w:r>
             <w:r>
               <w:rPr>
+                <w:noProof/>
                 <w:webHidden/>
               </w:rPr>
               <w:fldChar w:fldCharType="begin"/>
             </w:r>
             <w:r>
               <w:rPr>
+                <w:noProof/>
                 <w:webHidden/>
               </w:rPr>
-              <w:instrText xml:space="preserve"> PAGEREF _Toc213440011 \h </w:instrText>
-            </w:r>
-            <w:r>
-              <w:rPr>
+              <w:instrText xml:space="preserve"> PAGEREF _Toc229746196 \h </w:instrText>
+            </w:r>
+            <w:r>
+              <w:rPr>
+                <w:noProof/>
                 <w:webHidden/>
               </w:rPr>
             </w:r>
             <w:r>
               <w:rPr>
+                <w:noProof/>
                 <w:webHidden/>
               </w:rPr>
               <w:fldChar w:fldCharType="separate"/>
             </w:r>
             <w:r>
               <w:rPr>
+                <w:noProof/>
                 <w:webHidden/>
               </w:rPr>
-              <w:t>20</w:t>
-            </w:r>
-            <w:r>
-              <w:rPr>
+              <w:t>36</w:t>
+            </w:r>
+            <w:r>
+              <w:rPr>
+                <w:noProof/>
                 <w:webHidden/>
               </w:rPr>
               <w:fldChar w:fldCharType="end"/>
@@ -2316,54 +2604,63 @@
             <w:pStyle w:val="TOC1"/>
             <w:rPr>
               <w:rFonts w:asciiTheme="minorHAnsi" w:eastAsiaTheme="minorEastAsia" w:hAnsiTheme="minorHAnsi"/>
+              <w:noProof/>
               <w:color w:val="auto"/>
-              <w:lang w:eastAsia="ru-RU"/>
+              <w:lang w:val="ru-RU" w:eastAsia="ru-RU"/>
             </w:rPr>
           </w:pPr>
-          <w:hyperlink w:anchor="_Toc213440012" w:history="1">
+          <w:hyperlink w:anchor="_Toc229746197" w:history="1">
             <w:r>
               <w:rPr>
                 <w:rStyle w:val="Hyperlink"/>
+                <w:noProof/>
               </w:rPr>
               <w:t>7. Secinājumi</w:t>
             </w:r>
             <w:r>
               <w:rPr>
+                <w:noProof/>
                 <w:webHidden/>
               </w:rPr>
               <w:tab/>
             </w:r>
             <w:r>
               <w:rPr>
+                <w:noProof/>
                 <w:webHidden/>
               </w:rPr>
               <w:fldChar w:fldCharType="begin"/>
             </w:r>
             <w:r>
               <w:rPr>
+                <w:noProof/>
                 <w:webHidden/>
               </w:rPr>
-              <w:instrText xml:space="preserve"> PAGEREF _Toc213440012 \h </w:instrText>
-            </w:r>
-            <w:r>
-              <w:rPr>
+              <w:instrText xml:space="preserve"> PAGEREF _Toc229746197 \h </w:instrText>
+            </w:r>
+            <w:r>
+              <w:rPr>
+                <w:noProof/>
                 <w:webHidden/>
               </w:rPr>
             </w:r>
             <w:r>
               <w:rPr>
+                <w:noProof/>
                 <w:webHidden/>
               </w:rPr>
               <w:fldChar w:fldCharType="separate"/>
             </w:r>
             <w:r>
               <w:rPr>
+                <w:noProof/>
                 <w:webHidden/>
               </w:rPr>
-              <w:t>21</w:t>
-            </w:r>
-            <w:r>
-              <w:rPr>
+              <w:t>39</w:t>
+            </w:r>
+            <w:r>
+              <w:rPr>
+                <w:noProof/>
                 <w:webHidden/>
               </w:rPr>
               <w:fldChar w:fldCharType="end"/>
@@ -2375,54 +2672,63 @@
             <w:pStyle w:val="TOC1"/>
             <w:rPr>
               <w:rFonts w:asciiTheme="minorHAnsi" w:eastAsiaTheme="minorEastAsia" w:hAnsiTheme="minorHAnsi"/>
+              <w:noProof/>
               <w:color w:val="auto"/>
-              <w:lang w:eastAsia="ru-RU"/>
+              <w:lang w:val="ru-RU" w:eastAsia="ru-RU"/>
             </w:rPr>
           </w:pPr>
-          <w:hyperlink w:anchor="_Toc213440013" w:history="1">
+          <w:hyperlink w:anchor="_Toc229746198" w:history="1">
             <w:r>
               <w:rPr>
                 <w:rStyle w:val="Hyperlink"/>
+                <w:noProof/>
               </w:rPr>
               <w:t>8. Lietoto terminu un saīsinājumu skaidrojumi</w:t>
             </w:r>
             <w:r>
               <w:rPr>
+                <w:noProof/>
                 <w:webHidden/>
               </w:rPr>
               <w:tab/>
             </w:r>
             <w:r>
               <w:rPr>
+                <w:noProof/>
                 <w:webHidden/>
               </w:rPr>
               <w:fldChar w:fldCharType="begin"/>
             </w:r>
             <w:r>
               <w:rPr>
+                <w:noProof/>
                 <w:webHidden/>
               </w:rPr>
-              <w:instrText xml:space="preserve"> PAGEREF _Toc213440013 \h </w:instrText>
-            </w:r>
-            <w:r>
-              <w:rPr>
+              <w:instrText xml:space="preserve"> PAGEREF _Toc229746198 \h </w:instrText>
+            </w:r>
+            <w:r>
+              <w:rPr>
+                <w:noProof/>
                 <w:webHidden/>
               </w:rPr>
             </w:r>
             <w:r>
               <w:rPr>
+                <w:noProof/>
                 <w:webHidden/>
               </w:rPr>
               <w:fldChar w:fldCharType="separate"/>
             </w:r>
             <w:r>
               <w:rPr>
+                <w:noProof/>
                 <w:webHidden/>
               </w:rPr>
-              <w:t>22</w:t>
-            </w:r>
-            <w:r>
-              <w:rPr>
+              <w:t>40</w:t>
+            </w:r>
+            <w:r>
+              <w:rPr>
+                <w:noProof/>
                 <w:webHidden/>
               </w:rPr>
               <w:fldChar w:fldCharType="end"/>
@@ -2434,54 +2740,63 @@
             <w:pStyle w:val="TOC1"/>
             <w:rPr>
               <w:rFonts w:asciiTheme="minorHAnsi" w:eastAsiaTheme="minorEastAsia" w:hAnsiTheme="minorHAnsi"/>
+              <w:noProof/>
               <w:color w:val="auto"/>
-              <w:lang w:eastAsia="ru-RU"/>
+              <w:lang w:val="ru-RU" w:eastAsia="ru-RU"/>
             </w:rPr>
           </w:pPr>
-          <w:hyperlink w:anchor="_Toc213440014" w:history="1">
+          <w:hyperlink w:anchor="_Toc229746199" w:history="1">
             <w:r>
               <w:rPr>
                 <w:rStyle w:val="Hyperlink"/>
+                <w:noProof/>
               </w:rPr>
               <w:t>9. Literatūras un informācijas avotu saraksts</w:t>
             </w:r>
             <w:r>
               <w:rPr>
+                <w:noProof/>
                 <w:webHidden/>
               </w:rPr>
               <w:tab/>
             </w:r>
             <w:r>
               <w:rPr>
+                <w:noProof/>
                 <w:webHidden/>
               </w:rPr>
               <w:fldChar w:fldCharType="begin"/>
             </w:r>
             <w:r>
               <w:rPr>
+                <w:noProof/>
                 <w:webHidden/>
               </w:rPr>
-              <w:instrText xml:space="preserve"> PAGEREF _Toc213440014 \h </w:instrText>
-            </w:r>
-            <w:r>
-              <w:rPr>
+              <w:instrText xml:space="preserve"> PAGEREF _Toc229746199 \h </w:instrText>
+            </w:r>
+            <w:r>
+              <w:rPr>
+                <w:noProof/>
                 <w:webHidden/>
               </w:rPr>
             </w:r>
             <w:r>
               <w:rPr>
+                <w:noProof/>
                 <w:webHidden/>
               </w:rPr>
               <w:fldChar w:fldCharType="separate"/>
             </w:r>
             <w:r>
               <w:rPr>
+                <w:noProof/>
                 <w:webHidden/>
               </w:rPr>
-              <w:t>23</w:t>
-            </w:r>
-            <w:r>
-              <w:rPr>
+              <w:t>41</w:t>
+            </w:r>
+            <w:r>
+              <w:rPr>
+                <w:noProof/>
                 <w:webHidden/>
               </w:rPr>
               <w:fldChar w:fldCharType="end"/>
@@ -2493,54 +2808,63 @@
             <w:pStyle w:val="TOC1"/>
             <w:rPr>
               <w:rFonts w:asciiTheme="minorHAnsi" w:eastAsiaTheme="minorEastAsia" w:hAnsiTheme="minorHAnsi"/>
+              <w:noProof/>
               <w:color w:val="auto"/>
-              <w:lang w:eastAsia="ru-RU"/>
+              <w:lang w:val="ru-RU" w:eastAsia="ru-RU"/>
             </w:rPr>
           </w:pPr>
-          <w:hyperlink w:anchor="_Toc213440015" w:history="1">
+          <w:hyperlink w:anchor="_Toc229746200" w:history="1">
             <w:r>
               <w:rPr>
                 <w:rStyle w:val="Hyperlink"/>
+                <w:noProof/>
               </w:rPr>
               <w:t>Pielikums</w:t>
             </w:r>
             <w:r>
               <w:rPr>
+                <w:noProof/>
                 <w:webHidden/>
               </w:rPr>
               <w:tab/>
             </w:r>
             <w:r>
               <w:rPr>
+                <w:noProof/>
                 <w:webHidden/>
               </w:rPr>
               <w:fldChar w:fldCharType="begin"/>
             </w:r>
             <w:r>
               <w:rPr>
+                <w:noProof/>
                 <w:webHidden/>
               </w:rPr>
-              <w:instrText xml:space="preserve"> PAGEREF _Toc213440015 \h </w:instrText>
-            </w:r>
-            <w:r>
-              <w:rPr>
+              <w:instrText xml:space="preserve"> PAGEREF _Toc229746200 \h </w:instrText>
+            </w:r>
+            <w:r>
+              <w:rPr>
+                <w:noProof/>
                 <w:webHidden/>
               </w:rPr>
             </w:r>
             <w:r>
               <w:rPr>
+                <w:noProof/>
                 <w:webHidden/>
               </w:rPr>
               <w:fldChar w:fldCharType="separate"/>
             </w:r>
             <w:r>
               <w:rPr>
+                <w:noProof/>
                 <w:webHidden/>
               </w:rPr>
-              <w:t>2</w:t>
-            </w:r>
-            <w:r>
-              <w:rPr>
+              <w:t>43</w:t>
+            </w:r>
+            <w:r>
+              <w:rPr>
+                <w:noProof/>
                 <w:webHidden/>
               </w:rPr>
               <w:fldChar w:fldCharType="end"/>
@@ -2568,25 +2892,9 @@
     </w:sdt>
     <w:p>
       <w:pPr>
-        <w:spacing w:after="160" w:line="278" w:lineRule="auto"/>
-        <w:ind w:firstLine="0"/>
-        <w:jc w:val="left"/>
-        <w:rPr>
-          <w:rFonts w:eastAsiaTheme="majorEastAsia" w:cstheme="majorBidi"/>
-          <w:b/>
-          <w:sz w:val="28"/>
-          <w:szCs w:val="40"/>
-        </w:rPr>
-      </w:pPr>
-      <w:r>
-        <w:br w:type="page"/>
-      </w:r>
-    </w:p>
-    <w:p>
-      <w:pPr>
         <w:pStyle w:val="Heading1"/>
       </w:pPr>
-      <w:bookmarkStart w:id="0" w:name="_Toc213439980"/>
+      <w:bookmarkStart w:id="0" w:name="_Toc229746165"/>
       <w:r>
         <w:lastRenderedPageBreak/>
         <w:t>Ievads</w:t>
@@ -2690,18 +2998,12 @@
       <w:r>
         <w:t>No programmētāja puses tiek nodrošināta pilna projekta tehniskā izstrāde, kas ietver sistēmas arhitektūras plānošanu, datubāzes izveidi, lietotāja interfeisa un funkcionalitātes izstrādi. Tiek sagatavota arī projekta dokumentācija un izstrādes plāns, kā arī veikta testēšana un kļūdu novēršana, lai nodrošinātu stabilu un drošu platformas darbību.</w:t>
       </w:r>
-      <w:r>
-        <w:rPr>
-          <w:color w:val="FF0000"/>
-        </w:rPr>
-        <w:br w:type="page"/>
-      </w:r>
     </w:p>
     <w:p>
       <w:pPr>
         <w:pStyle w:val="Heading1"/>
       </w:pPr>
-      <w:bookmarkStart w:id="1" w:name="_Toc213439981"/>
+      <w:bookmarkStart w:id="1" w:name="_Toc229746166"/>
       <w:r>
         <w:rPr>
           <w:rStyle w:val="Heading1Char"/>
@@ -2725,7 +3027,6 @@
           <w:lang w:eastAsia="lv-LV"/>
         </w:rPr>
       </w:pPr>
-      <w:bookmarkStart w:id="2" w:name="_Toc213439982"/>
       <w:r>
         <w:rPr>
           <w:lang w:eastAsia="lv-LV"/>
@@ -2822,17 +3123,12 @@
         </w:rPr>
         <w:t>Rezultātā tiks izveidota strukturēta un funkcionējoša tīmekļa platforma, kas nodrošinās pilnvērtīgu detektīvu spēles pieredzi ar lietotāju radītu saturu un kvalitātes kontroli.</w:t>
       </w:r>
-      <w:r>
-        <w:rPr>
-          <w:lang w:eastAsia="lv-LV"/>
-        </w:rPr>
-        <w:br w:type="page"/>
-      </w:r>
     </w:p>
     <w:p>
       <w:pPr>
         <w:pStyle w:val="Heading1"/>
       </w:pPr>
+      <w:bookmarkStart w:id="2" w:name="_Toc229746167"/>
       <w:r>
         <w:lastRenderedPageBreak/>
         <w:t>2</w:t>
@@ -2854,7 +3150,7 @@
       <w:pPr>
         <w:pStyle w:val="Heading2"/>
       </w:pPr>
-      <w:bookmarkStart w:id="3" w:name="_Toc213439983"/>
+      <w:bookmarkStart w:id="3" w:name="_Toc229746168"/>
       <w:r>
         <w:t>2</w:t>
       </w:r>
@@ -2872,7 +3168,7 @@
       <w:pPr>
         <w:pStyle w:val="Heading2"/>
       </w:pPr>
-      <w:bookmarkStart w:id="4" w:name="_Toc213439984"/>
+      <w:bookmarkStart w:id="4" w:name="_Toc229746169"/>
       <w:r>
         <w:t>2</w:t>
       </w:r>
@@ -2894,7 +3190,7 @@
       <w:pPr>
         <w:pStyle w:val="Heading3"/>
       </w:pPr>
-      <w:bookmarkStart w:id="5" w:name="_Toc213439985"/>
+      <w:bookmarkStart w:id="5" w:name="_Toc229746170"/>
       <w:r>
         <w:t xml:space="preserve">2.2.1. </w:t>
       </w:r>
@@ -5426,7 +5722,7 @@
       <w:pPr>
         <w:pStyle w:val="Heading3"/>
       </w:pPr>
-      <w:bookmarkStart w:id="6" w:name="_Toc213439987"/>
+      <w:bookmarkStart w:id="6" w:name="_Toc229746171"/>
       <w:r>
         <w:t>2.2.</w:t>
       </w:r>
@@ -5442,6 +5738,7 @@
       <w:r>
         <w:t>utorizētiem lietotājiem</w:t>
       </w:r>
+      <w:bookmarkEnd w:id="6"/>
     </w:p>
     <w:p>
       <w:r>
@@ -8901,16 +9198,17 @@
       <w:pPr>
         <w:pStyle w:val="Heading3"/>
       </w:pPr>
+      <w:bookmarkStart w:id="7" w:name="_Toc229746172"/>
       <w:r>
         <w:t xml:space="preserve">2.2.3. </w:t>
       </w:r>
       <w:r>
         <w:t>Moderator</w:t>
       </w:r>
-      <w:bookmarkEnd w:id="6"/>
       <w:r>
         <w:t>iem</w:t>
       </w:r>
+      <w:bookmarkEnd w:id="7"/>
     </w:p>
     <w:p>
       <w:r>
@@ -10529,7 +10827,7 @@
       <w:pPr>
         <w:pStyle w:val="Heading3"/>
       </w:pPr>
-      <w:bookmarkStart w:id="7" w:name="_Toc213439988"/>
+      <w:bookmarkStart w:id="8" w:name="_Toc229746173"/>
       <w:r>
         <w:t>2.2.</w:t>
       </w:r>
@@ -10539,10 +10837,10 @@
       <w:r>
         <w:t>. Administrator</w:t>
       </w:r>
-      <w:bookmarkEnd w:id="7"/>
       <w:r>
         <w:t>iem</w:t>
       </w:r>
+      <w:bookmarkEnd w:id="8"/>
     </w:p>
     <w:p>
       <w:r>
@@ -11867,7 +12165,6 @@
       <w:pPr>
         <w:pStyle w:val="Heading4"/>
       </w:pPr>
-      <w:bookmarkStart w:id="8" w:name="_Toc213439989"/>
       <w:r>
         <w:t>2.2.4.3. Moderatora deaktivizācija</w:t>
       </w:r>
@@ -12054,13 +12351,14 @@
       <w:pPr>
         <w:pStyle w:val="Heading2"/>
       </w:pPr>
+      <w:bookmarkStart w:id="9" w:name="_Toc229746174"/>
       <w:r>
         <w:t>2.</w:t>
       </w:r>
       <w:r>
         <w:t>3. Sistēmas nefunkcionālās prasības</w:t>
       </w:r>
-      <w:bookmarkEnd w:id="8"/>
+      <w:bookmarkEnd w:id="9"/>
     </w:p>
     <w:p>
       <w:r>
@@ -12074,7 +12372,7 @@
           <w:color w:val="auto"/>
         </w:rPr>
       </w:pPr>
-      <w:bookmarkStart w:id="9" w:name="_Toc213439990"/>
+      <w:bookmarkStart w:id="10" w:name="_Toc229746175"/>
       <w:r>
         <w:rPr>
           <w:rStyle w:val="Strong"/>
@@ -12083,7 +12381,7 @@
         </w:rPr>
         <w:t>2.3.1. Veiktspējas prasības</w:t>
       </w:r>
-      <w:bookmarkEnd w:id="9"/>
+      <w:bookmarkEnd w:id="10"/>
     </w:p>
     <w:p>
       <w:pPr>
@@ -12128,7 +12426,7 @@
       <w:pPr>
         <w:pStyle w:val="Heading3"/>
       </w:pPr>
-      <w:bookmarkStart w:id="10" w:name="_Toc213439991"/>
+      <w:bookmarkStart w:id="11" w:name="_Toc229746176"/>
       <w:r>
         <w:rPr>
           <w:rStyle w:val="Strong"/>
@@ -12137,7 +12435,7 @@
         </w:rPr>
         <w:t>2.3.2. Projekta tehniskie ierobežojumi</w:t>
       </w:r>
-      <w:bookmarkEnd w:id="10"/>
+      <w:bookmarkEnd w:id="11"/>
     </w:p>
     <w:p>
       <w:pPr>
@@ -12182,7 +12480,7 @@
       <w:pPr>
         <w:pStyle w:val="Heading3"/>
       </w:pPr>
-      <w:bookmarkStart w:id="11" w:name="_Toc213439992"/>
+      <w:bookmarkStart w:id="12" w:name="_Toc229746177"/>
       <w:r>
         <w:rPr>
           <w:rStyle w:val="Strong"/>
@@ -12191,7 +12489,7 @@
         </w:rPr>
         <w:t>2.3.3. Lietotāja saskarnes prasības</w:t>
       </w:r>
-      <w:bookmarkEnd w:id="11"/>
+      <w:bookmarkEnd w:id="12"/>
     </w:p>
     <w:p>
       <w:pPr>
@@ -12234,7 +12532,7 @@
       <w:pPr>
         <w:pStyle w:val="Heading3"/>
       </w:pPr>
-      <w:bookmarkStart w:id="12" w:name="_Toc213439993"/>
+      <w:bookmarkStart w:id="13" w:name="_Toc229746178"/>
       <w:r>
         <w:rPr>
           <w:rStyle w:val="Strong"/>
@@ -12243,7 +12541,7 @@
         </w:rPr>
         <w:t>2.3.4. Drošības un kvalitātes prasības</w:t>
       </w:r>
-      <w:bookmarkEnd w:id="12"/>
+      <w:bookmarkEnd w:id="13"/>
     </w:p>
     <w:p>
       <w:pPr>
@@ -12285,14 +12583,14 @@
       <w:pPr>
         <w:pStyle w:val="Heading2"/>
       </w:pPr>
-      <w:bookmarkStart w:id="13" w:name="_Toc213439994"/>
+      <w:bookmarkStart w:id="14" w:name="_Toc229746179"/>
       <w:r>
         <w:t>2</w:t>
       </w:r>
       <w:r>
         <w:t>.4. Gala lietotāja raksturiezīmes</w:t>
       </w:r>
-      <w:bookmarkEnd w:id="13"/>
+      <w:bookmarkEnd w:id="14"/>
       <w:r>
         <w:t xml:space="preserve"> </w:t>
       </w:r>
@@ -12321,7 +12619,7 @@
       <w:pPr>
         <w:pStyle w:val="Heading1"/>
       </w:pPr>
-      <w:bookmarkStart w:id="14" w:name="_Toc213439995"/>
+      <w:bookmarkStart w:id="15" w:name="_Toc229746180"/>
       <w:r>
         <w:lastRenderedPageBreak/>
         <w:t>3</w:t>
@@ -12329,7 +12627,7 @@
       <w:r>
         <w:t>. Izstrādes līdzekļu, rīku apraksts un izvēles pamatojums</w:t>
       </w:r>
-      <w:bookmarkEnd w:id="14"/>
+      <w:bookmarkEnd w:id="15"/>
       <w:r>
         <w:t xml:space="preserve"> </w:t>
       </w:r>
@@ -12343,14 +12641,14 @@
       <w:pPr>
         <w:pStyle w:val="Heading2"/>
       </w:pPr>
-      <w:bookmarkStart w:id="15" w:name="_Toc213439996"/>
+      <w:bookmarkStart w:id="16" w:name="_Toc229746181"/>
       <w:r>
         <w:t>3</w:t>
       </w:r>
       <w:r>
         <w:t>.1. Izvēlēto risinājuma līdzekļu un valodu apraksts</w:t>
       </w:r>
-      <w:bookmarkEnd w:id="15"/>
+      <w:bookmarkEnd w:id="16"/>
       <w:r>
         <w:t xml:space="preserve"> </w:t>
       </w:r>
@@ -12595,14 +12893,14 @@
       <w:pPr>
         <w:pStyle w:val="Heading2"/>
       </w:pPr>
-      <w:bookmarkStart w:id="16" w:name="_Toc213439997"/>
+      <w:bookmarkStart w:id="17" w:name="_Toc229746182"/>
       <w:r>
         <w:t>3</w:t>
       </w:r>
       <w:r>
         <w:t>.2. Iespējamo (alternatīvo) risinājuma līdzekļu un valodu apraksts</w:t>
       </w:r>
-      <w:bookmarkEnd w:id="16"/>
+      <w:bookmarkEnd w:id="17"/>
       <w:r>
         <w:t xml:space="preserve"> </w:t>
       </w:r>
@@ -13902,7 +14200,6 @@
           <w:szCs w:val="40"/>
         </w:rPr>
       </w:pPr>
-      <w:bookmarkStart w:id="17" w:name="_Toc213439998"/>
       <w:r>
         <w:br w:type="page"/>
       </w:r>
@@ -13911,6 +14208,7 @@
       <w:pPr>
         <w:pStyle w:val="Heading1"/>
       </w:pPr>
+      <w:bookmarkStart w:id="18" w:name="_Toc229746183"/>
       <w:r>
         <w:lastRenderedPageBreak/>
         <w:t>4</w:t>
@@ -13918,120 +14216,530 @@
       <w:r>
         <w:t>. Sistēmas modelēšana un projektēšana</w:t>
       </w:r>
-      <w:bookmarkEnd w:id="17"/>
+      <w:bookmarkEnd w:id="18"/>
       <w:r>
         <w:t xml:space="preserve"> </w:t>
       </w:r>
     </w:p>
     <w:p>
+      <w:pPr>
+        <w:rPr>
+          <w:lang w:val="ru-RU"/>
+        </w:rPr>
+      </w:pPr>
       <w:r>
         <w:t>Apraksta sistēmas arhitektūru, struktūru un darbības principus, izmantojot dažādus modelēšanas paņēmienus.</w:t>
+      </w:r>
+      <w:r>
+        <w:rPr>
+          <w:lang w:val="ru-RU"/>
+        </w:rPr>
+        <w:t xml:space="preserve"> </w:t>
+      </w:r>
+      <w:r>
+        <w:rPr>
+          <w:lang w:val="ru-RU"/>
+        </w:rPr>
+        <w:t>Modelēšana ļauj vizualizēt sistēmu pirms tās faktiskās izstrādes, identificēt iespējamās problēmas un uzlabot komunikāciju starp izstrādātājiem un pasūtītāju. Šajā nodaļā tiek izmantoti gan statiskie, gan dinamiskie modeļi, lai pilnībā aprakstītu sistēmu no dažādiem skatu punktiem.</w:t>
       </w:r>
     </w:p>
     <w:p>
       <w:pPr>
         <w:pStyle w:val="Heading2"/>
       </w:pPr>
-      <w:bookmarkStart w:id="18" w:name="_Toc213439999"/>
+      <w:bookmarkStart w:id="19" w:name="_Toc229746184"/>
       <w:r>
         <w:t>4</w:t>
       </w:r>
       <w:r>
         <w:t>.1. Sistēmas struktūras modelis</w:t>
-      </w:r>
-      <w:bookmarkEnd w:id="18"/>
-    </w:p>
-    <w:p>
-      <w:r>
-        <w:t>Attēlo sistēmas komponentes un to savstarpējās attiecības, piemēram, izmantojot ER diagrammas vai klašu diagrammas.</w:t>
-      </w:r>
-    </w:p>
-    <w:p>
-      <w:pPr>
-        <w:pStyle w:val="Heading3"/>
-        <w:rPr>
-          <w:lang w:val="ru-RU"/>
-        </w:rPr>
-      </w:pPr>
-      <w:bookmarkStart w:id="19" w:name="_Toc213440000"/>
-      <w:r>
-        <w:t>4</w:t>
-      </w:r>
-      <w:r>
-        <w:t>.1.1. Sistēmas struktūra (</w:t>
-      </w:r>
-      <w:r>
-        <w:t>Izvietojuma</w:t>
-      </w:r>
-      <w:r>
-        <w:t xml:space="preserve"> diagramma)</w:t>
       </w:r>
       <w:bookmarkEnd w:id="19"/>
     </w:p>
     <w:p>
-      <w:r>
-        <w:t>Izvietojuma diagramma attēlo detektīvu platformas fizisko arhitektūru un komponentu sadalījumu pa dažādām mezglu grupām. Diagramma parāda trīs galvenās daļas: klienta pusi, servera pusi un izstrādes vidi.</w:t>
-      </w:r>
-      <w:r>
+      <w:pPr>
+        <w:rPr>
+          <w:lang w:val="ru-RU"/>
+        </w:rPr>
+      </w:pPr>
+      <w:r>
+        <w:t>Attēlo sistēmas komponentes un to savstarpējās attiecības, piemēram, izmantojot ER diagrammas vai klašu diagrammas.</w:t>
+      </w:r>
+      <w:r>
+        <w:rPr>
+          <w:lang w:val="ru-RU"/>
+        </w:rPr>
         <w:t xml:space="preserve"> </w:t>
+      </w:r>
+      <w:r>
+        <w:rPr>
+          <w:lang w:val="ru-RU"/>
+        </w:rPr>
+        <w:t>Šis modelis fokusējas uz sistēmas statisko uzbūvi — kādi dati tiek glabāti, kādas ir entītijas un kā tās savienojas viena ar otru. Struktūras modelis ir būtisks pamats datubāzes projektēšanai un sistēmas arhitektūras izpratnei, jo tas parāda, kā informācija plūst un tiek organizēta visā platformā.</w:t>
       </w:r>
     </w:p>
     <w:p>
       <w:pPr>
-        <w:ind w:firstLine="0"/>
-        <w:jc w:val="center"/>
-        <w:rPr>
-          <w:b/>
-          <w:bCs/>
-        </w:rPr>
-      </w:pPr>
-      <w:bookmarkStart w:id="20" w:name="_Toc213440001"/>
-      <w:r>
-        <w:rPr>
-          <w:b/>
-          <w:bCs/>
-        </w:rPr>
-        <w:t xml:space="preserve">1. attēls. </w:t>
-      </w:r>
-      <w:r>
-        <w:rPr>
-          <w:b/>
-          <w:bCs/>
-        </w:rPr>
+        <w:pStyle w:val="Heading3"/>
+        <w:rPr>
+          <w:lang w:val="ru-RU"/>
+        </w:rPr>
+      </w:pPr>
+      <w:bookmarkStart w:id="20" w:name="_Toc229746185"/>
+      <w:r>
+        <w:t>4</w:t>
+      </w:r>
+      <w:r>
+        <w:t>.1.1. Sistēmas struktūra (</w:t>
+      </w:r>
+      <w:r>
         <w:t>Izvietojuma</w:t>
       </w:r>
       <w:r>
-        <w:t xml:space="preserve"> </w:t>
-      </w:r>
-      <w:r>
-        <w:rPr>
-          <w:b/>
-          <w:bCs/>
-        </w:rPr>
-        <w:t>diagramma</w:t>
-      </w:r>
-    </w:p>
-    <w:p>
-      <w:pPr>
-        <w:pStyle w:val="Heading3"/>
-      </w:pPr>
-      <w:r>
-        <w:lastRenderedPageBreak/>
-        <w:t>4</w:t>
-      </w:r>
-      <w:r>
-        <w:t>.1.2. ER diagramma</w:t>
+        <w:t xml:space="preserve"> diagramma)</w:t>
       </w:r>
       <w:bookmarkEnd w:id="20"/>
     </w:p>
     <w:p>
       <w:pPr>
         <w:rPr>
+          <w:lang w:val="ru-RU"/>
+        </w:rPr>
+      </w:pPr>
+      <w:r>
+        <w:t>Izvietojuma diagramma attēlo platformas fizisko arhitektūru un komponentu sadalījumu pa dažādām mezglu grupām. Diagramma parāda trīs galvenās daļas: klienta pusi, servera pusi un izstrādes vidi. Klienta pusē atrodas lietotāja ierīce ar tīmekļa pārlūku</w:t>
+      </w:r>
+      <w:r>
+        <w:t xml:space="preserve">. </w:t>
+      </w:r>
+      <w:r>
+        <w:t>Servera pusē ir trīs savstarpēji savienoti slāņi: tīmekļa serveris, kas uztver HTTP pieprasījumus; lietojumserveris</w:t>
+      </w:r>
+      <w:r>
+        <w:t xml:space="preserve">, </w:t>
+      </w:r>
+      <w:r>
+        <w:t>kas apstrādā biznesa loģiku, autentifikāciju, autorizāciju un e-pastu sūtīšanu; un datubāzes serveris, kas glabā visus sistēmas datus.</w:t>
+      </w:r>
+    </w:p>
+    <w:p>
+      <w:pPr>
+        <w:ind w:firstLine="0"/>
+        <w:jc w:val="center"/>
+        <w:rPr>
+          <w:lang w:val="ru-RU"/>
+        </w:rPr>
+      </w:pPr>
+      <w:r>
+        <w:rPr>
+          <w:lang w:val="ru-RU"/>
+        </w:rPr>
+        <w:drawing>
+          <wp:inline distT="0" distB="0" distL="0" distR="0" wp14:anchorId="15BB314D" wp14:editId="3F602D55">
+            <wp:extent cx="4787900" cy="3023021"/>
+            <wp:effectExtent l="0" t="0" r="0" b="6350"/>
+            <wp:docPr id="1098725259" name="Picture 14"/>
+            <wp:cNvGraphicFramePr>
+              <a:graphicFrameLocks xmlns:a="http://schemas.openxmlformats.org/drawingml/2006/main" noChangeAspect="1"/>
+            </wp:cNvGraphicFramePr>
+            <a:graphic xmlns:a="http://schemas.openxmlformats.org/drawingml/2006/main">
+              <a:graphicData uri="http://schemas.openxmlformats.org/drawingml/2006/picture">
+                <pic:pic xmlns:pic="http://schemas.openxmlformats.org/drawingml/2006/picture">
+                  <pic:nvPicPr>
+                    <pic:cNvPr id="0" name="Picture 41"/>
+                    <pic:cNvPicPr>
+                      <a:picLocks noChangeAspect="1" noChangeArrowheads="1"/>
+                    </pic:cNvPicPr>
+                  </pic:nvPicPr>
+                  <pic:blipFill>
+                    <a:blip r:embed="rId10">
+                      <a:extLst>
+                        <a:ext uri="{28A0092B-C50C-407E-A947-70E740481C1C}">
+                          <a14:useLocalDpi xmlns:a14="http://schemas.microsoft.com/office/drawing/2010/main" val="0"/>
+                        </a:ext>
+                      </a:extLst>
+                    </a:blip>
+                    <a:srcRect/>
+                    <a:stretch>
+                      <a:fillRect/>
+                    </a:stretch>
+                  </pic:blipFill>
+                  <pic:spPr bwMode="auto">
+                    <a:xfrm>
+                      <a:off x="0" y="0"/>
+                      <a:ext cx="4802338" cy="3032137"/>
+                    </a:xfrm>
+                    <a:prstGeom prst="rect">
+                      <a:avLst/>
+                    </a:prstGeom>
+                    <a:noFill/>
+                    <a:ln>
+                      <a:noFill/>
+                    </a:ln>
+                  </pic:spPr>
+                </pic:pic>
+              </a:graphicData>
+            </a:graphic>
+          </wp:inline>
+        </w:drawing>
+      </w:r>
+    </w:p>
+    <w:p>
+      <w:pPr>
+        <w:ind w:firstLine="0"/>
+        <w:jc w:val="center"/>
+        <w:rPr>
+          <w:b/>
+          <w:bCs/>
+        </w:rPr>
+      </w:pPr>
+      <w:r>
+        <w:rPr>
+          <w:b/>
+          <w:bCs/>
+        </w:rPr>
+        <w:t xml:space="preserve">1. attēls. </w:t>
+      </w:r>
+      <w:r>
+        <w:rPr>
+          <w:b/>
+          <w:bCs/>
+        </w:rPr>
+        <w:t>Izvietojuma</w:t>
+      </w:r>
+      <w:r>
+        <w:t xml:space="preserve"> </w:t>
+      </w:r>
+      <w:r>
+        <w:rPr>
+          <w:b/>
+          <w:bCs/>
+        </w:rPr>
+        <w:t>diagramma</w:t>
+      </w:r>
+    </w:p>
+    <w:p>
+      <w:pPr>
+        <w:pStyle w:val="Heading3"/>
+      </w:pPr>
+      <w:bookmarkStart w:id="21" w:name="_Toc229746186"/>
+      <w:r>
+        <w:lastRenderedPageBreak/>
+        <w:t>4</w:t>
+      </w:r>
+      <w:r>
+        <w:t>.1.2. ER diagramma</w:t>
+      </w:r>
+      <w:bookmarkEnd w:id="21"/>
+    </w:p>
+    <w:p>
+      <w:pPr>
+        <w:rPr>
           <w:lang w:val="en-US"/>
         </w:rPr>
       </w:pPr>
       <w:r>
         <w:t>ER diagramma attēlo detektīvu platformas datubāzes struktūru, parādot galvenās entītijas un attiecības starp tām. Diagramma vizualizē, kā dati tiek organizēti un savienoti viens ar otru.</w:t>
+      </w:r>
+      <w:r>
+        <w:rPr>
+          <w:lang w:val="en-US"/>
+        </w:rPr>
+        <w:t xml:space="preserve"> </w:t>
+      </w:r>
+      <w:proofErr w:type="spellStart"/>
+      <w:r>
+        <w:rPr>
+          <w:lang w:val="en-US"/>
+        </w:rPr>
+        <w:t>Tā</w:t>
+      </w:r>
+      <w:proofErr w:type="spellEnd"/>
+      <w:r>
+        <w:rPr>
+          <w:lang w:val="en-US"/>
+        </w:rPr>
+        <w:t xml:space="preserve"> </w:t>
+      </w:r>
+      <w:proofErr w:type="spellStart"/>
+      <w:r>
+        <w:rPr>
+          <w:lang w:val="en-US"/>
+        </w:rPr>
+        <w:t>palīdz</w:t>
+      </w:r>
+      <w:proofErr w:type="spellEnd"/>
+      <w:r>
+        <w:rPr>
+          <w:lang w:val="en-US"/>
+        </w:rPr>
+        <w:t xml:space="preserve"> </w:t>
+      </w:r>
+      <w:proofErr w:type="spellStart"/>
+      <w:r>
+        <w:rPr>
+          <w:lang w:val="en-US"/>
+        </w:rPr>
+        <w:t>izstrādātājiem</w:t>
+      </w:r>
+      <w:proofErr w:type="spellEnd"/>
+      <w:r>
+        <w:rPr>
+          <w:lang w:val="en-US"/>
+        </w:rPr>
+        <w:t xml:space="preserve"> </w:t>
+      </w:r>
+      <w:proofErr w:type="spellStart"/>
+      <w:r>
+        <w:rPr>
+          <w:lang w:val="en-US"/>
+        </w:rPr>
+        <w:t>saprast</w:t>
+      </w:r>
+      <w:proofErr w:type="spellEnd"/>
+      <w:r>
+        <w:rPr>
+          <w:lang w:val="en-US"/>
+        </w:rPr>
+        <w:t xml:space="preserve">, </w:t>
+      </w:r>
+      <w:proofErr w:type="spellStart"/>
+      <w:r>
+        <w:rPr>
+          <w:lang w:val="en-US"/>
+        </w:rPr>
+        <w:t>kādas</w:t>
+      </w:r>
+      <w:proofErr w:type="spellEnd"/>
+      <w:r>
+        <w:rPr>
+          <w:lang w:val="en-US"/>
+        </w:rPr>
+        <w:t xml:space="preserve"> </w:t>
+      </w:r>
+      <w:proofErr w:type="spellStart"/>
+      <w:r>
+        <w:rPr>
+          <w:lang w:val="en-US"/>
+        </w:rPr>
+        <w:t>tabulas</w:t>
+      </w:r>
+      <w:proofErr w:type="spellEnd"/>
+      <w:r>
+        <w:rPr>
+          <w:lang w:val="en-US"/>
+        </w:rPr>
+        <w:t xml:space="preserve"> </w:t>
+      </w:r>
+      <w:proofErr w:type="spellStart"/>
+      <w:r>
+        <w:rPr>
+          <w:lang w:val="en-US"/>
+        </w:rPr>
+        <w:t>nepieciešamas</w:t>
+      </w:r>
+      <w:proofErr w:type="spellEnd"/>
+      <w:r>
+        <w:rPr>
+          <w:lang w:val="en-US"/>
+        </w:rPr>
+        <w:t xml:space="preserve"> un </w:t>
+      </w:r>
+      <w:proofErr w:type="spellStart"/>
+      <w:r>
+        <w:rPr>
+          <w:lang w:val="en-US"/>
+        </w:rPr>
+        <w:t>kā</w:t>
+      </w:r>
+      <w:proofErr w:type="spellEnd"/>
+      <w:r>
+        <w:rPr>
+          <w:lang w:val="en-US"/>
+        </w:rPr>
+        <w:t xml:space="preserve"> </w:t>
+      </w:r>
+      <w:proofErr w:type="spellStart"/>
+      <w:r>
+        <w:rPr>
+          <w:lang w:val="en-US"/>
+        </w:rPr>
+        <w:t>tās</w:t>
+      </w:r>
+      <w:proofErr w:type="spellEnd"/>
+      <w:r>
+        <w:rPr>
+          <w:lang w:val="en-US"/>
+        </w:rPr>
+        <w:t xml:space="preserve"> </w:t>
+      </w:r>
+      <w:proofErr w:type="spellStart"/>
+      <w:r>
+        <w:rPr>
+          <w:lang w:val="en-US"/>
+        </w:rPr>
+        <w:t>savienot</w:t>
+      </w:r>
+      <w:proofErr w:type="spellEnd"/>
+      <w:r>
+        <w:rPr>
+          <w:lang w:val="en-US"/>
+        </w:rPr>
+        <w:t xml:space="preserve"> </w:t>
+      </w:r>
+      <w:proofErr w:type="spellStart"/>
+      <w:r>
+        <w:rPr>
+          <w:lang w:val="en-US"/>
+        </w:rPr>
+        <w:t>ar</w:t>
+      </w:r>
+      <w:proofErr w:type="spellEnd"/>
+      <w:r>
+        <w:rPr>
+          <w:lang w:val="en-US"/>
+        </w:rPr>
+        <w:t xml:space="preserve"> </w:t>
+      </w:r>
+      <w:proofErr w:type="spellStart"/>
+      <w:r>
+        <w:rPr>
+          <w:lang w:val="en-US"/>
+        </w:rPr>
+        <w:t>atslēgām</w:t>
+      </w:r>
+      <w:proofErr w:type="spellEnd"/>
+      <w:r>
+        <w:rPr>
+          <w:lang w:val="en-US"/>
+        </w:rPr>
+        <w:t xml:space="preserve">. </w:t>
+      </w:r>
+      <w:proofErr w:type="spellStart"/>
+      <w:r>
+        <w:rPr>
+          <w:lang w:val="en-US"/>
+        </w:rPr>
+        <w:t>Diagramma</w:t>
+      </w:r>
+      <w:proofErr w:type="spellEnd"/>
+      <w:r>
+        <w:rPr>
+          <w:lang w:val="en-US"/>
+        </w:rPr>
+        <w:t xml:space="preserve"> </w:t>
+      </w:r>
+      <w:proofErr w:type="spellStart"/>
+      <w:r>
+        <w:rPr>
+          <w:lang w:val="en-US"/>
+        </w:rPr>
+        <w:t>ir</w:t>
+      </w:r>
+      <w:proofErr w:type="spellEnd"/>
+      <w:r>
+        <w:rPr>
+          <w:lang w:val="en-US"/>
+        </w:rPr>
+        <w:t xml:space="preserve"> </w:t>
+      </w:r>
+      <w:proofErr w:type="spellStart"/>
+      <w:r>
+        <w:rPr>
+          <w:lang w:val="en-US"/>
+        </w:rPr>
+        <w:t>būtisks</w:t>
+      </w:r>
+      <w:proofErr w:type="spellEnd"/>
+      <w:r>
+        <w:rPr>
+          <w:lang w:val="en-US"/>
+        </w:rPr>
+        <w:t xml:space="preserve"> </w:t>
+      </w:r>
+      <w:proofErr w:type="spellStart"/>
+      <w:r>
+        <w:rPr>
+          <w:lang w:val="en-US"/>
+        </w:rPr>
+        <w:t>pamats</w:t>
+      </w:r>
+      <w:proofErr w:type="spellEnd"/>
+      <w:r>
+        <w:rPr>
+          <w:lang w:val="en-US"/>
+        </w:rPr>
+        <w:t xml:space="preserve"> </w:t>
+      </w:r>
+      <w:proofErr w:type="spellStart"/>
+      <w:r>
+        <w:rPr>
+          <w:lang w:val="en-US"/>
+        </w:rPr>
+        <w:t>datubāzes</w:t>
+      </w:r>
+      <w:proofErr w:type="spellEnd"/>
+      <w:r>
+        <w:rPr>
+          <w:lang w:val="en-US"/>
+        </w:rPr>
+        <w:t xml:space="preserve"> </w:t>
+      </w:r>
+      <w:proofErr w:type="spellStart"/>
+      <w:r>
+        <w:rPr>
+          <w:lang w:val="en-US"/>
+        </w:rPr>
+        <w:t>izveidei</w:t>
+      </w:r>
+      <w:proofErr w:type="spellEnd"/>
+      <w:r>
+        <w:rPr>
+          <w:lang w:val="en-US"/>
+        </w:rPr>
+        <w:t xml:space="preserve"> un </w:t>
+      </w:r>
+      <w:proofErr w:type="spellStart"/>
+      <w:r>
+        <w:rPr>
+          <w:lang w:val="en-US"/>
+        </w:rPr>
+        <w:t>turpmākai</w:t>
+      </w:r>
+      <w:proofErr w:type="spellEnd"/>
+      <w:r>
+        <w:rPr>
+          <w:lang w:val="en-US"/>
+        </w:rPr>
+        <w:t xml:space="preserve"> </w:t>
+      </w:r>
+      <w:proofErr w:type="spellStart"/>
+      <w:r>
+        <w:rPr>
+          <w:lang w:val="en-US"/>
+        </w:rPr>
+        <w:t>sistēmas</w:t>
+      </w:r>
+      <w:proofErr w:type="spellEnd"/>
+      <w:r>
+        <w:rPr>
+          <w:lang w:val="en-US"/>
+        </w:rPr>
+        <w:t xml:space="preserve"> </w:t>
+      </w:r>
+      <w:proofErr w:type="spellStart"/>
+      <w:r>
+        <w:rPr>
+          <w:lang w:val="en-US"/>
+        </w:rPr>
+        <w:t>attīstībai</w:t>
+      </w:r>
+      <w:proofErr w:type="spellEnd"/>
+      <w:r>
+        <w:rPr>
+          <w:lang w:val="en-US"/>
+        </w:rPr>
+        <w:t>.</w:t>
       </w:r>
       <w:r>
         <w:rPr>
@@ -14055,7 +14763,7 @@
                     </pic:cNvPicPr>
                   </pic:nvPicPr>
                   <pic:blipFill>
-                    <a:blip r:embed="rId10" cstate="print">
+                    <a:blip r:embed="rId11" cstate="print">
                       <a:extLst>
                         <a:ext uri="{28A0092B-C50C-407E-A947-70E740481C1C}">
                           <a14:useLocalDpi xmlns:a14="http://schemas.microsoft.com/office/drawing/2010/main" val="0"/>
@@ -14117,83 +14825,54 @@
       <w:pPr>
         <w:pStyle w:val="Heading2"/>
       </w:pPr>
-      <w:bookmarkStart w:id="21" w:name="_Toc213440002"/>
+      <w:bookmarkStart w:id="22" w:name="_Toc229746187"/>
       <w:r>
         <w:t>4</w:t>
       </w:r>
       <w:r>
         <w:t>.2. Funkcionālais un dinamiskais sistēmas modelis</w:t>
-      </w:r>
-      <w:bookmarkEnd w:id="21"/>
-    </w:p>
-    <w:p>
-      <w:r>
-        <w:t>Apraksta sistēmas darbību laikā, lietotāju mijiedarbību un procesu plūsmu, izmantojot Use Case vai secību diagrammas.</w:t>
-      </w:r>
-    </w:p>
-    <w:p>
-      <w:pPr>
-        <w:pStyle w:val="Heading3"/>
-      </w:pPr>
-      <w:bookmarkStart w:id="22" w:name="_Toc213440003"/>
-      <w:r>
-        <w:t>4</w:t>
-      </w:r>
-      <w:r>
-        <w:t>.2.1. Lietojumgadījumu diagramma (Use Case)</w:t>
       </w:r>
       <w:bookmarkEnd w:id="22"/>
     </w:p>
     <w:p>
-      <w:pPr>
-        <w:rPr>
-          <w:lang w:val="en-US"/>
-        </w:rPr>
-      </w:pPr>
-      <w:r>
-        <w:t>Use Case diagramma attēlo sistēmas funkcionalitāti no lietotāja perspektīvas, parādot dažādu akt</w:t>
-      </w:r>
-      <w:r>
-        <w:t>o</w:t>
-      </w:r>
-      <w:r>
-        <w:t xml:space="preserve">ru lomas un to mijiedarbību ar sistēmu. </w:t>
+      <w:r>
+        <w:t xml:space="preserve">Apraksta sistēmas darbību laikā, lietotāju mijiedarbību un procesu plūsmu, izmantojot Use Case vai secību diagrammas. Atšķirībā no statiskā modeļa, dinamiskais modelis parāda, kā sistēma uzvedas noteiktās situācijās un kā lietotāji ar to mijiedarbojas laika gaitā. Šis modelis </w:t>
+      </w:r>
+      <w:r>
+        <w:lastRenderedPageBreak/>
+        <w:t>palīdz identificēt sistēmas funkcionālās prasības, aprakstīt dažādus lietošanas scenārijus un saprast, kā sistēmai būtu jāreaģē uz lietotāja darbībām vai kļūdu situācijām.</w:t>
       </w:r>
     </w:p>
     <w:p>
       <w:pPr>
-        <w:ind w:firstLine="0"/>
-        <w:jc w:val="center"/>
-        <w:rPr>
-          <w:b/>
-          <w:bCs/>
-        </w:rPr>
-      </w:pPr>
-      <w:bookmarkStart w:id="23" w:name="_Toc213440004"/>
-      <w:r>
-        <w:rPr>
-          <w:b/>
-          <w:bCs/>
-        </w:rPr>
-        <w:lastRenderedPageBreak/>
-        <w:t>3. attēls. Lietojumgadījumu diagramma</w:t>
-      </w:r>
-    </w:p>
-    <w:p>
-      <w:pPr>
         <w:pStyle w:val="Heading3"/>
       </w:pPr>
+      <w:bookmarkStart w:id="23" w:name="_Toc229746188"/>
       <w:r>
         <w:t>4</w:t>
       </w:r>
       <w:r>
-        <w:t>.2.2. Aktivitāšu diagramma (Activity)</w:t>
+        <w:t>.2.1. Lietojumgadījumu diagramma (Use Case)</w:t>
       </w:r>
       <w:bookmarkEnd w:id="23"/>
     </w:p>
     <w:p>
-      <w:r>
-        <w:t>Aktivitātes diagramma attēlo secīgas darbības, ko lietotājs veic, lai izmeklētu detektīvu lietu platformā. Diagramma vizualizē visu izmeklēšanas procesu no lietas izvēles līdz gala lēmuma pieņemšanai un vērtējuma atstāšanai.</w:t>
+      <w:pPr>
+        <w:rPr>
+          <w:lang w:val="en-US"/>
+        </w:rPr>
+      </w:pPr>
+      <w:r>
+        <w:t>Use Case diagramma attēlo sistēmas funkcionalitāti no lietotāja perspektīvas, parādot dažādu akt</w:t>
+      </w:r>
+      <w:r>
+        <w:t>o</w:t>
+      </w:r>
+      <w:r>
+        <w:t xml:space="preserve">ru lomas un to mijiedarbību ar sistēmu. </w:t>
+      </w:r>
+      <w:r>
+        <w:t>Tā sniedz augsta līmeņa pārskatu par to, ko katrs lietotājs var darīt sistēmā. Diagramma palīdz noteikt sistēmas robežas un identificēt trūkstošās funkcionalitātes pirms izstrādes sākuma.</w:t>
       </w:r>
     </w:p>
     <w:p>
@@ -14201,41 +14880,167 @@
         <w:ind w:firstLine="0"/>
         <w:jc w:val="center"/>
         <w:rPr>
+          <w:lang w:val="en-US"/>
+        </w:rPr>
+      </w:pPr>
+      <w:r>
+        <w:rPr>
+          <w:lang w:val="ru-RU"/>
+        </w:rPr>
+        <w:drawing>
+          <wp:inline distT="0" distB="0" distL="0" distR="0" wp14:anchorId="68A0E5E2" wp14:editId="12CCFA19">
+            <wp:extent cx="5939790" cy="4258945"/>
+            <wp:effectExtent l="0" t="0" r="3810" b="8255"/>
+            <wp:docPr id="1702845635" name="Picture 11"/>
+            <wp:cNvGraphicFramePr>
+              <a:graphicFrameLocks xmlns:a="http://schemas.openxmlformats.org/drawingml/2006/main" noChangeAspect="1"/>
+            </wp:cNvGraphicFramePr>
+            <a:graphic xmlns:a="http://schemas.openxmlformats.org/drawingml/2006/main">
+              <a:graphicData uri="http://schemas.openxmlformats.org/drawingml/2006/picture">
+                <pic:pic xmlns:pic="http://schemas.openxmlformats.org/drawingml/2006/picture">
+                  <pic:nvPicPr>
+                    <pic:cNvPr id="0" name="Picture 33"/>
+                    <pic:cNvPicPr>
+                      <a:picLocks noChangeAspect="1" noChangeArrowheads="1"/>
+                    </pic:cNvPicPr>
+                  </pic:nvPicPr>
+                  <pic:blipFill>
+                    <a:blip r:embed="rId12" cstate="print">
+                      <a:extLst>
+                        <a:ext uri="{28A0092B-C50C-407E-A947-70E740481C1C}">
+                          <a14:useLocalDpi xmlns:a14="http://schemas.microsoft.com/office/drawing/2010/main" val="0"/>
+                        </a:ext>
+                      </a:extLst>
+                    </a:blip>
+                    <a:srcRect/>
+                    <a:stretch>
+                      <a:fillRect/>
+                    </a:stretch>
+                  </pic:blipFill>
+                  <pic:spPr bwMode="auto">
+                    <a:xfrm>
+                      <a:off x="0" y="0"/>
+                      <a:ext cx="5939790" cy="4258945"/>
+                    </a:xfrm>
+                    <a:prstGeom prst="rect">
+                      <a:avLst/>
+                    </a:prstGeom>
+                    <a:noFill/>
+                    <a:ln>
+                      <a:noFill/>
+                    </a:ln>
+                  </pic:spPr>
+                </pic:pic>
+              </a:graphicData>
+            </a:graphic>
+          </wp:inline>
+        </w:drawing>
+      </w:r>
+    </w:p>
+    <w:p>
+      <w:pPr>
+        <w:ind w:firstLine="0"/>
+        <w:jc w:val="center"/>
+        <w:rPr>
           <w:b/>
           <w:bCs/>
-        </w:rPr>
-      </w:pPr>
-      <w:bookmarkStart w:id="24" w:name="_Toc213440005"/>
+          <w:lang w:val="ru-RU"/>
+        </w:rPr>
+      </w:pPr>
       <w:r>
         <w:rPr>
           <w:b/>
           <w:bCs/>
         </w:rPr>
-        <w:t>4. attēls. Aktivitāšu diagramma</w:t>
+        <w:t>3. attēls. Lietojumgadījumu diagramma</w:t>
       </w:r>
     </w:p>
     <w:p>
       <w:pPr>
         <w:pStyle w:val="Heading3"/>
       </w:pPr>
+      <w:bookmarkStart w:id="24" w:name="_Toc229746189"/>
       <w:r>
         <w:t>4</w:t>
       </w:r>
       <w:r>
-        <w:t>.2.3. Stāvokļu diagramma (State)</w:t>
+        <w:t>.2.2. Aktivitāšu diagramma (Activity)</w:t>
       </w:r>
       <w:bookmarkEnd w:id="24"/>
     </w:p>
     <w:p>
-      <w:bookmarkStart w:id="25" w:name="_Toc213440006"/>
-      <w:r>
-        <w:t>Stāvokļu diagramma attēlo detektīvu lietas iespējamos stāvokļus un pārejas starp tiem no lietas izveides brīža līdz tās pilnīgai dzēšanai. Diagramma balstās uz projektu 2.2.2.5. un 2.2.3.4. sadaļu prasībām.</w:t>
+      <w:r>
+        <w:t>Aktivitātes diagramma attēlo secīgas darbības, ko lietotājs veic, lai izmeklētu detektīvu lietu platformā. Diagramma vizualizē visu izmeklēšanas procesu no lietas izvēles līdz gala lēmuma pieņemšanai un vērtējuma atstāšanai.</w:t>
+      </w:r>
+      <w:r>
+        <w:t xml:space="preserve"> </w:t>
+      </w:r>
+      <w:r>
+        <w:t>Tā skaidri parāda, ka pirms lēmuma pieņemšanas ir jāsavāc vismaz divi pierādījumi.</w:t>
       </w:r>
     </w:p>
     <w:p>
       <w:pPr>
         <w:ind w:firstLine="0"/>
-      </w:pPr>
+        <w:rPr>
+          <w:lang w:val="en-US"/>
+        </w:rPr>
+      </w:pPr>
+      <w:r>
+        <w:rPr>
+          <w:noProof/>
+          <w:lang w:val="en-US"/>
+        </w:rPr>
+        <w:lastRenderedPageBreak/>
+        <w:drawing>
+          <wp:inline distT="0" distB="0" distL="0" distR="0" wp14:anchorId="0610F504" wp14:editId="46957FC6">
+            <wp:extent cx="5912283" cy="7518400"/>
+            <wp:effectExtent l="0" t="0" r="0" b="6350"/>
+            <wp:docPr id="844717569" name="Picture 12"/>
+            <wp:cNvGraphicFramePr>
+              <a:graphicFrameLocks xmlns:a="http://schemas.openxmlformats.org/drawingml/2006/main" noChangeAspect="1"/>
+            </wp:cNvGraphicFramePr>
+            <a:graphic xmlns:a="http://schemas.openxmlformats.org/drawingml/2006/main">
+              <a:graphicData uri="http://schemas.openxmlformats.org/drawingml/2006/picture">
+                <pic:pic xmlns:pic="http://schemas.openxmlformats.org/drawingml/2006/picture">
+                  <pic:nvPicPr>
+                    <pic:cNvPr id="0" name="Picture 35"/>
+                    <pic:cNvPicPr>
+                      <a:picLocks noChangeAspect="1" noChangeArrowheads="1"/>
+                    </pic:cNvPicPr>
+                  </pic:nvPicPr>
+                  <pic:blipFill>
+                    <a:blip r:embed="rId13">
+                      <a:extLst>
+                        <a:ext uri="{28A0092B-C50C-407E-A947-70E740481C1C}">
+                          <a14:useLocalDpi xmlns:a14="http://schemas.microsoft.com/office/drawing/2010/main" val="0"/>
+                        </a:ext>
+                      </a:extLst>
+                    </a:blip>
+                    <a:srcRect/>
+                    <a:stretch>
+                      <a:fillRect/>
+                    </a:stretch>
+                  </pic:blipFill>
+                  <pic:spPr bwMode="auto">
+                    <a:xfrm>
+                      <a:off x="0" y="0"/>
+                      <a:ext cx="5926410" cy="7536365"/>
+                    </a:xfrm>
+                    <a:prstGeom prst="rect">
+                      <a:avLst/>
+                    </a:prstGeom>
+                    <a:noFill/>
+                    <a:ln>
+                      <a:noFill/>
+                    </a:ln>
+                  </pic:spPr>
+                </pic:pic>
+              </a:graphicData>
+            </a:graphic>
+          </wp:inline>
+        </w:drawing>
+      </w:r>
     </w:p>
     <w:p>
       <w:pPr>
@@ -14251,67 +15056,172 @@
           <w:b/>
           <w:bCs/>
         </w:rPr>
-        <w:t xml:space="preserve">5. attēls. </w:t>
-      </w:r>
-      <w:r>
-        <w:rPr>
-          <w:b/>
-          <w:bCs/>
-        </w:rPr>
-        <w:t>Stāvokļu diagramma</w:t>
+        <w:t>4. attēls. Aktivitāšu diagramma</w:t>
       </w:r>
     </w:p>
     <w:p>
       <w:pPr>
-        <w:pStyle w:val="Heading2"/>
-      </w:pPr>
+        <w:pStyle w:val="Heading3"/>
+      </w:pPr>
+      <w:bookmarkStart w:id="25" w:name="_Toc229746190"/>
       <w:r>
         <w:t>4</w:t>
       </w:r>
       <w:r>
-        <w:t>.3. Datu struktūru apraksts</w:t>
+        <w:t>.2.3. Stāvokļu diagramma (State)</w:t>
       </w:r>
       <w:bookmarkEnd w:id="25"/>
     </w:p>
     <w:p>
-      <w:r>
-        <w:t>Datu struktūru aprakstā tiek detalizēti analizēta sistēmas datubāzes uzbūve, iekļaujot tabulu struktūru, to atribūtus, datu tipus, kā arī savstarpējās attiecības. Datu bāze ir izstrādāta, izmantojot relāciju pieeju, kas nodrošina strukturētu datu glabāšanu un efektīvu piekļuvi informācijai. Katrs datu modelis atspoguļo konkrētu sistēmas funkcionalitātes daļu un ir cieši saistīts ar biznesa loģiku.</w:t>
+      <w:pPr>
+        <w:rPr>
+          <w:rStyle w:val="eop"/>
+        </w:rPr>
+      </w:pPr>
+      <w:r>
+        <w:t>Stāvokļu diagramma attēlo detektīvu lietas iespējamos stāvokļus un pārejas starp tiem no lietas izveides brīža līdz tās pilnīgai dzēšanai. Diagramma balstās uz projektu 2.2.2.5. un 2.2.3.4. sadaļu prasībām.</w:t>
       </w:r>
     </w:p>
     <w:p>
-      <w:r>
-        <w:t xml:space="preserve">Galvenā tabula </w:t>
-      </w:r>
-      <w:r>
+      <w:pPr>
+        <w:ind w:firstLine="0"/>
+      </w:pPr>
+      <w:r>
+        <w:rPr>
+          <w:lang w:val="ru-RU"/>
+        </w:rPr>
+        <w:lastRenderedPageBreak/>
+        <w:drawing>
+          <wp:inline distT="0" distB="0" distL="0" distR="0" wp14:anchorId="69EA93E1" wp14:editId="3973C992">
+            <wp:extent cx="5939790" cy="4435475"/>
+            <wp:effectExtent l="0" t="0" r="3810" b="3175"/>
+            <wp:docPr id="1799129378" name="Picture 16"/>
+            <wp:cNvGraphicFramePr>
+              <a:graphicFrameLocks xmlns:a="http://schemas.openxmlformats.org/drawingml/2006/main" noChangeAspect="1"/>
+            </wp:cNvGraphicFramePr>
+            <a:graphic xmlns:a="http://schemas.openxmlformats.org/drawingml/2006/main">
+              <a:graphicData uri="http://schemas.openxmlformats.org/drawingml/2006/picture">
+                <pic:pic xmlns:pic="http://schemas.openxmlformats.org/drawingml/2006/picture">
+                  <pic:nvPicPr>
+                    <pic:cNvPr id="0" name="Picture 48"/>
+                    <pic:cNvPicPr>
+                      <a:picLocks noChangeAspect="1" noChangeArrowheads="1"/>
+                    </pic:cNvPicPr>
+                  </pic:nvPicPr>
+                  <pic:blipFill>
+                    <a:blip r:embed="rId14">
+                      <a:extLst>
+                        <a:ext uri="{28A0092B-C50C-407E-A947-70E740481C1C}">
+                          <a14:useLocalDpi xmlns:a14="http://schemas.microsoft.com/office/drawing/2010/main" val="0"/>
+                        </a:ext>
+                      </a:extLst>
+                    </a:blip>
+                    <a:srcRect/>
+                    <a:stretch>
+                      <a:fillRect/>
+                    </a:stretch>
+                  </pic:blipFill>
+                  <pic:spPr bwMode="auto">
+                    <a:xfrm>
+                      <a:off x="0" y="0"/>
+                      <a:ext cx="5939790" cy="4435475"/>
+                    </a:xfrm>
+                    <a:prstGeom prst="rect">
+                      <a:avLst/>
+                    </a:prstGeom>
+                    <a:noFill/>
+                    <a:ln>
+                      <a:noFill/>
+                    </a:ln>
+                  </pic:spPr>
+                </pic:pic>
+              </a:graphicData>
+            </a:graphic>
+          </wp:inline>
+        </w:drawing>
+      </w:r>
+    </w:p>
+    <w:p>
+      <w:pPr>
+        <w:ind w:firstLine="0"/>
+      </w:pPr>
+    </w:p>
+    <w:p>
+      <w:pPr>
+        <w:ind w:firstLine="0"/>
+        <w:jc w:val="center"/>
         <w:rPr>
           <w:b/>
           <w:bCs/>
         </w:rPr>
-        <w:t>users</w:t>
-      </w:r>
-      <w:r>
-        <w:t xml:space="preserve"> satur informāciju par sistēmas lietotājiem, tostarp vārdu, lietotājvārdu, e-pasta adresi, šifrētu paroli, lomu, bio, avataru un konta statusu. Šī tabula nodrošina autentifikācijas un autorizācijas mehānismus, kā arī lietotāju profilu pārvaldību un piekļuves tiesību kontroli sistēmā.</w:t>
+      </w:pPr>
+      <w:r>
+        <w:rPr>
+          <w:b/>
+          <w:bCs/>
+        </w:rPr>
+        <w:t xml:space="preserve">5. attēls. </w:t>
+      </w:r>
+      <w:r>
+        <w:rPr>
+          <w:b/>
+          <w:bCs/>
+        </w:rPr>
+        <w:t>Stāvokļu diagramma</w:t>
       </w:r>
     </w:p>
     <w:p>
-      <w:r>
-        <w:t xml:space="preserve">Tabula </w:t>
+      <w:pPr>
+        <w:pStyle w:val="Heading2"/>
+      </w:pPr>
+      <w:bookmarkStart w:id="26" w:name="_Toc229746191"/>
+      <w:r>
+        <w:t>4</w:t>
+      </w:r>
+      <w:r>
+        <w:t>.3. Datu struktūru apraksts</w:t>
+      </w:r>
+      <w:bookmarkEnd w:id="26"/>
+    </w:p>
+    <w:p>
+      <w:r>
+        <w:t>Datu struktūru aprakstā tiek detalizēti analizēta sistēmas datubāzes uzbūve, iekļaujot tabulu struktūru, to atribūtus, datu tipus, kā arī savstarpējās attiecības. Datu bāze ir izstrādāta, izmantojot relāciju pieeju, kas nodrošina strukturētu datu glabāšanu un efektīvu piekļuvi informācijai. Katrs datu modelis atspoguļo konkrētu sistēmas funkcionalitātes daļu un ir cieši saistīts ar biznesa loģiku.</w:t>
+      </w:r>
+    </w:p>
+    <w:p>
+      <w:r>
+        <w:t xml:space="preserve">Galvenā tabula </w:t>
       </w:r>
       <w:r>
         <w:rPr>
           <w:b/>
           <w:bCs/>
         </w:rPr>
-        <w:t>cases</w:t>
-      </w:r>
-      <w:r>
-        <w:t xml:space="preserve"> tiek izmantota, lai glabātu informāciju par detektīvspēļu lietām. Tajā ietilpst nosaukums, apraksts, žanrs, izveidotāja identifikators un statuss. Katra lieta var būt saistīta ar konkrētu žanru, kas tiek definēts tabulā </w:t>
+        <w:t>users</w:t>
+      </w:r>
+      <w:r>
+        <w:t xml:space="preserve"> satur informāciju par sistēmas lietotājiem, tostarp vārdu, lietotājvārdu, e-pasta adresi, šifrētu paroli, lomu, bio, avataru un konta statusu. Šī tabula nodrošina autentifikācijas un autorizācijas mehānismus, kā arī lietotāju profilu pārvaldību un piekļuves tiesību kontroli sistēmā.</w:t>
+      </w:r>
+    </w:p>
+    <w:p>
+      <w:r>
+        <w:t xml:space="preserve">Tabula </w:t>
       </w:r>
       <w:r>
         <w:rPr>
           <w:b/>
           <w:bCs/>
         </w:rPr>
+        <w:t>cases</w:t>
+      </w:r>
+      <w:r>
+        <w:t xml:space="preserve"> tiek izmantota, lai glabātu informāciju par detektīvspēļu lietām. Tajā ietilpst nosaukums, apraksts, žanrs, izveidotāja identifikators un statuss. Katra lieta var būt saistīta ar konkrētu žanru, kas tiek definēts tabulā </w:t>
+      </w:r>
+      <w:r>
+        <w:rPr>
+          <w:b/>
+          <w:bCs/>
+        </w:rPr>
         <w:t>genres</w:t>
       </w:r>
       <w:r>
@@ -14320,6 +15230,7 @@
     </w:p>
     <w:p>
       <w:r>
+        <w:lastRenderedPageBreak/>
         <w:t xml:space="preserve">Tabula </w:t>
       </w:r>
       <w:r>
@@ -14375,11 +15286,7 @@
         <w:t>suspects</w:t>
       </w:r>
       <w:r>
-        <w:t xml:space="preserve"> satur </w:t>
-      </w:r>
-      <w:r>
-        <w:lastRenderedPageBreak/>
-        <w:t>iespējamos aizdomās turamos. Šāda pieeja nodrošina datu normalizāciju un ļauj vienai lietai pievienot vairākus pierādījumus un vairākus aizdomās turamos, izvairoties no datu dublēšanās.</w:t>
+        <w:t xml:space="preserve"> satur iespējamos aizdomās turamos. Šāda pieeja nodrošina datu normalizāciju un ļauj vienai lietai pievienot vairākus pierādījumus un vairākus aizdomās turamos, izvairoties no datu dublēšanās.</w:t>
       </w:r>
     </w:p>
     <w:p>
@@ -14438,27 +15345,36 @@
       </w:r>
     </w:p>
     <w:p>
-      <w:pPr>
-        <w:rPr>
-          <w:lang w:val="ru-RU"/>
-        </w:rPr>
-      </w:pPr>
       <w:r>
         <w:t>Savukārt Laravel ietvars nodrošina sistēmas biznesa loģiku un datu apstrādi. Tas izmanto Eloquent ORM, kas katrai datubāzes tabulai piešķir atbilstošu modeli un ļauj strādāt ar datiem objektorientētā veidā. Laravel migrācijas nodrošina datubāzes struktūras versiju kontroli, kas ļauj sistemātiski veikt izmaiņas un atkārtoti ģenerēt datubāzi izstrādes laikā. Tas padara sistēmu viegli uzturamu, paplašināmu un strukturētu.</w:t>
       </w:r>
     </w:p>
     <w:p>
       <w:pPr>
+        <w:spacing w:after="160" w:line="278" w:lineRule="auto"/>
+        <w:ind w:firstLine="0"/>
+        <w:jc w:val="left"/>
+        <w:rPr>
+          <w:lang w:val="ru-RU"/>
+        </w:rPr>
+      </w:pPr>
+      <w:r>
+        <w:br w:type="page"/>
+      </w:r>
+    </w:p>
+    <w:p>
+      <w:pPr>
         <w:pStyle w:val="Heading1"/>
       </w:pPr>
-      <w:bookmarkStart w:id="26" w:name="_Toc213440007"/>
-      <w:r>
+      <w:bookmarkStart w:id="27" w:name="_Toc229746192"/>
+      <w:r>
+        <w:lastRenderedPageBreak/>
         <w:t>5</w:t>
       </w:r>
       <w:r>
         <w:t>. Lietotāju ceļvedis</w:t>
       </w:r>
-      <w:bookmarkEnd w:id="26"/>
+      <w:bookmarkEnd w:id="27"/>
     </w:p>
     <w:p>
       <w:pPr>
@@ -14480,36 +15396,36 @@
       <w:pPr>
         <w:pStyle w:val="Heading1"/>
       </w:pPr>
-      <w:bookmarkStart w:id="27" w:name="_Toc213440008"/>
+      <w:bookmarkStart w:id="28" w:name="_Toc229746193"/>
       <w:r>
         <w:lastRenderedPageBreak/>
         <w:t>6</w:t>
       </w:r>
       <w:r>
         <w:t>. Testēšanas dokumentācija</w:t>
-      </w:r>
-      <w:bookmarkEnd w:id="27"/>
-    </w:p>
-    <w:p>
-      <w:r>
-        <w:t>Apraksta sistēmas testēšanas pieeju, testēšanas scenārijus, rezultātus un konstatētās kļūdas, kā arī to novēršanu.</w:t>
-      </w:r>
-    </w:p>
-    <w:p>
-      <w:pPr>
-        <w:pStyle w:val="Heading2"/>
-      </w:pPr>
-      <w:bookmarkStart w:id="28" w:name="_Toc213440009"/>
-      <w:r>
-        <w:t>6</w:t>
-      </w:r>
-      <w:r>
-        <w:t>.1. Izvēlētās testēšanas metodes, rīku apraksts un pamatojums</w:t>
       </w:r>
       <w:bookmarkEnd w:id="28"/>
     </w:p>
     <w:p>
       <w:r>
+        <w:t>Apraksta sistēmas testēšanas pieeju, testēšanas scenārijus, rezultātus un konstatētās kļūdas, kā arī to novēršanu.</w:t>
+      </w:r>
+    </w:p>
+    <w:p>
+      <w:pPr>
+        <w:pStyle w:val="Heading2"/>
+      </w:pPr>
+      <w:bookmarkStart w:id="29" w:name="_Toc229746194"/>
+      <w:r>
+        <w:t>6</w:t>
+      </w:r>
+      <w:r>
+        <w:t>.1. Izvēlētās testēšanas metodes, rīku apraksts un pamatojums</w:t>
+      </w:r>
+      <w:bookmarkEnd w:id="29"/>
+    </w:p>
+    <w:p>
+      <w:r>
         <w:t>Projekts izmanto funkcionālo testēšanu, lietojamības testēšanu un veiktspējas pārbaudes. Funkcionālā testēšana nodrošina, ka katra platformas daļa (reģistrācija, pieteikšanās, lietu izveide, moderācija) strādā pēc prasībām. Lietojamības testēšana palīdzēja pārliecināties, ka interfeiss ir saprotams un ērti lietojams. Veiktspējas testi tika izmantoti, lai pārbaudītu lapas ielādes ātrumu un sistēmas darbību pie lielāka lietotāju skaita.</w:t>
       </w:r>
     </w:p>
@@ -14527,7 +15443,7 @@
       <w:pPr>
         <w:pStyle w:val="Heading2"/>
         <w:sectPr>
-          <w:footerReference w:type="first" r:id="rId11"/>
+          <w:footerReference w:type="first" r:id="rId15"/>
           <w:pgSz w:w="11906" w:h="16838"/>
           <w:pgMar w:top="1134" w:right="1134" w:bottom="1134" w:left="1418" w:header="709" w:footer="709" w:gutter="0"/>
           <w:pgNumType w:start="2"/>
@@ -14536,7 +15452,6 @@
           <w:docGrid w:linePitch="360"/>
         </w:sectPr>
       </w:pPr>
-      <w:bookmarkStart w:id="29" w:name="_Toc213440010"/>
     </w:p>
     <w:p>
       <w:pPr>
@@ -14545,6 +15460,7 @@
           <w:bCs/>
         </w:rPr>
       </w:pPr>
+      <w:bookmarkStart w:id="30" w:name="_Toc229746195"/>
       <w:r>
         <w:lastRenderedPageBreak/>
         <w:t>6</w:t>
@@ -14552,7 +15468,7 @@
       <w:r>
         <w:t>.2. Testpiemēru kopa</w:t>
       </w:r>
-      <w:bookmarkEnd w:id="29"/>
+      <w:bookmarkEnd w:id="30"/>
     </w:p>
     <w:p>
       <w:pPr>
@@ -28816,7 +29732,7 @@
       <w:pPr>
         <w:pStyle w:val="Heading2"/>
       </w:pPr>
-      <w:bookmarkStart w:id="30" w:name="_Toc213440011"/>
+      <w:bookmarkStart w:id="31" w:name="_Toc229746196"/>
       <w:r>
         <w:lastRenderedPageBreak/>
         <w:t>6</w:t>
@@ -28824,7 +29740,7 @@
       <w:r>
         <w:t>.3. Testēšanas žurnāls</w:t>
       </w:r>
-      <w:bookmarkEnd w:id="30"/>
+      <w:bookmarkEnd w:id="31"/>
     </w:p>
     <w:p>
       <w:pPr>
@@ -37005,7 +37921,6 @@
           <w:szCs w:val="40"/>
         </w:rPr>
       </w:pPr>
-      <w:bookmarkStart w:id="31" w:name="_Toc213440012"/>
       <w:r>
         <w:br w:type="page"/>
       </w:r>
@@ -37016,9 +37931,7 @@
         <w:sectPr>
           <w:pgSz w:w="16838" w:h="11906" w:orient="landscape" w:code="9"/>
           <w:pgMar w:top="1418" w:right="1134" w:bottom="1134" w:left="1134" w:header="709" w:footer="709" w:gutter="0"/>
-          <w:pgNumType w:start="2"/>
           <w:cols w:space="708"/>
-          <w:titlePg/>
           <w:docGrid w:linePitch="360"/>
         </w:sectPr>
       </w:pPr>
@@ -37027,6 +37940,7 @@
       <w:pPr>
         <w:pStyle w:val="Heading1"/>
       </w:pPr>
+      <w:bookmarkStart w:id="32" w:name="_Toc229746197"/>
       <w:r>
         <w:lastRenderedPageBreak/>
         <w:t xml:space="preserve">7. </w:t>
@@ -37034,7 +37948,7 @@
       <w:r>
         <w:t>Secinājumi</w:t>
       </w:r>
-      <w:bookmarkEnd w:id="31"/>
+      <w:bookmarkEnd w:id="32"/>
       <w:r>
         <w:t xml:space="preserve"> </w:t>
       </w:r>
@@ -37060,7 +37974,7 @@
       <w:pPr>
         <w:pStyle w:val="Heading1"/>
       </w:pPr>
-      <w:bookmarkStart w:id="32" w:name="_Toc213440013"/>
+      <w:bookmarkStart w:id="33" w:name="_Toc229746198"/>
       <w:r>
         <w:lastRenderedPageBreak/>
         <w:t xml:space="preserve">8. </w:t>
@@ -37068,7 +37982,7 @@
       <w:r>
         <w:t>Lietoto terminu un saīsinājumu skaidrojumi</w:t>
       </w:r>
-      <w:bookmarkEnd w:id="32"/>
+      <w:bookmarkEnd w:id="33"/>
     </w:p>
     <w:p>
       <w:pPr>
@@ -37090,7 +38004,7 @@
       <w:pPr>
         <w:pStyle w:val="Heading1"/>
       </w:pPr>
-      <w:bookmarkStart w:id="33" w:name="_Toc213440014"/>
+      <w:bookmarkStart w:id="34" w:name="_Toc229746199"/>
       <w:r>
         <w:lastRenderedPageBreak/>
         <w:t xml:space="preserve">9. </w:t>
@@ -37098,7 +38012,7 @@
       <w:r>
         <w:t>Literatūras un informācijas avotu saraksts</w:t>
       </w:r>
-      <w:bookmarkEnd w:id="33"/>
+      <w:bookmarkEnd w:id="34"/>
     </w:p>
     <w:p>
       <w:pPr>
@@ -37108,7 +38022,6 @@
         <w:sectPr>
           <w:pgSz w:w="11906" w:h="16838"/>
           <w:pgMar w:top="1134" w:right="1134" w:bottom="1134" w:left="1418" w:header="709" w:footer="709" w:gutter="0"/>
-          <w:pgNumType w:start="2"/>
           <w:cols w:space="708"/>
           <w:titlePg/>
           <w:docGrid w:linePitch="360"/>
@@ -37125,11 +38038,12 @@
         <w:pStyle w:val="Heading1"/>
         <w:spacing w:before="6120"/>
       </w:pPr>
-      <w:bookmarkStart w:id="34" w:name="_Toc213440015"/>
-      <w:r>
+      <w:bookmarkStart w:id="35" w:name="_Toc229746200"/>
+      <w:r>
+        <w:lastRenderedPageBreak/>
         <w:t>Pielikums</w:t>
       </w:r>
-      <w:bookmarkEnd w:id="34"/>
+      <w:bookmarkEnd w:id="35"/>
     </w:p>
     <w:p>
       <w:pPr>
@@ -37220,7 +38134,6 @@
     <w:sectPr>
       <w:pgSz w:w="11906" w:h="16838"/>
       <w:pgMar w:top="1134" w:right="1134" w:bottom="1134" w:left="1418" w:header="709" w:footer="709" w:gutter="0"/>
-      <w:pgNumType w:start="2"/>
       <w:cols w:space="708"/>
       <w:titlePg/>
       <w:docGrid w:linePitch="360"/>
@@ -37297,6 +38210,13 @@
   <w:p>
     <w:pPr>
       <w:pStyle w:val="Footer"/>
+      <w:ind w:firstLine="0"/>
+    </w:pPr>
+  </w:p>
+  <w:p>
+    <w:pPr>
+      <w:pStyle w:val="Footer"/>
+      <w:jc w:val="center"/>
     </w:pPr>
   </w:p>
 </w:ftr>
@@ -41700,10 +42620,11 @@
     <w:link w:val="Heading1Char"/>
     <w:uiPriority w:val="9"/>
     <w:qFormat/>
-    <w:rsid w:val="00710170"/>
+    <w:rsid w:val="00FD0287"/>
     <w:pPr>
       <w:keepNext/>
       <w:keepLines/>
+      <w:pageBreakBefore/>
       <w:spacing w:after="240"/>
       <w:ind w:firstLine="0"/>
       <w:jc w:val="center"/>
@@ -41922,7 +42843,7 @@
     <w:basedOn w:val="DefaultParagraphFont"/>
     <w:link w:val="Heading1"/>
     <w:uiPriority w:val="9"/>
-    <w:rsid w:val="00710170"/>
+    <w:rsid w:val="00FD0287"/>
     <w:rPr>
       <w:rFonts w:ascii="Times New Roman" w:eastAsiaTheme="majorEastAsia" w:hAnsi="Times New Roman" w:cstheme="majorBidi"/>
       <w:b/>
@@ -42466,6 +43387,18 @@
       <w:color w:val="000000" w:themeColor="text1"/>
     </w:rPr>
   </w:style>
+  <w:style w:type="character" w:styleId="FollowedHyperlink">
+    <w:name w:val="FollowedHyperlink"/>
+    <w:basedOn w:val="DefaultParagraphFont"/>
+    <w:uiPriority w:val="99"/>
+    <w:semiHidden/>
+    <w:unhideWhenUsed/>
+    <w:rsid w:val="00B11899"/>
+    <w:rPr>
+      <w:color w:val="96607D" w:themeColor="followedHyperlink"/>
+      <w:u w:val="single"/>
+    </w:rPr>
+  </w:style>
 </w:styles>
 </file>
 

</xml_diff>